<commit_message>
Replace the shell scripts with a Java build tool; keep the project pure Java
- delete build.sh, run-cli.sh, run-gui.sh, run-web.sh, run-tests.sh
- add ke.ku.sco310.qr.tools.ProjectBuilder: a Java build tool that drives the JavaCompiler
  API and writes the JAR with JarOutputStream, keeping the Java-Bean manifest entries
- move the mask comparison instrument into the verification suite (MaskComparisonTool)
- move the report image helpers out of the project root into docs/report-tooling/
- document the build as javac + java commands only; update report, README and pom.xml
</commit_message>
<xml_diff>
--- a/docs/SCO310-QR-Component-Suite-Report.docx
+++ b/docs/SCO310-QR-Component-Suite-Report.docx
@@ -292,7 +292,7 @@
               <w:t>qr-component-suite/</w:t>
             </w:r>
             <w:r>
-              <w:t xml:space="preserve"> (48 Java source files, 6 572 lines; 51 compiled classes)</w:t>
+              <w:t xml:space="preserve"> (49 Java source files, 6 844 lines; 52 compiled classes)</w:t>
             </w:r>
           </w:p>
         </w:tc>
@@ -1217,7 +1217,7 @@
           <w:p>
             <w:r/>
             <w:r>
-              <w:t>6 572 lines of Java across 48 files, 0 external dependency for the engine</w:t>
+              <w:t>6 844 lines of Java across 49 files, 0 external dependency for the engine</w:t>
             </w:r>
           </w:p>
         </w:tc>
@@ -1231,7 +1231,7 @@
               <w:rPr>
                 <w:rFonts w:ascii="Consolas" w:hAnsi="Consolas"/>
               </w:rPr>
-              <w:t>build.sh</w:t>
+              <w:t>ProjectBuilder</w:t>
             </w:r>
             <w:r>
               <w:t xml:space="preserve"> output</w:t>
@@ -1490,7 +1490,7 @@
               <w:rPr>
                 <w:rFonts w:ascii="Consolas" w:hAnsi="Consolas"/>
               </w:rPr>
-              <w:t>tools/BeanInspector</w:t>
+              <w:t>ke.ku.sco310.qr.tools.BeanInspector</w:t>
             </w:r>
           </w:p>
         </w:tc>
@@ -1692,9 +1692,9 @@
         </w:rPr>
         <w:t>qr-component-studio/</w:t>
         <w:br/>
-        <w:t>├── src/main/java/ke/ku/sco310/qr/     48 Java sources: components, engine, front ends</w:t>
+        <w:t>├── src/main/java/ke/ku/sco310/qr/     49 Java sources: components, engine, front ends, build tool</w:t>
         <w:br/>
-        <w:t>├── src/test/java/ke/ku/sco310/qr/test/ verification suite (7 files, 1 396 lines)</w:t>
+        <w:t>├── src/test/java/ke/ku/sco310/qr/test/ verification suite (8 files)</w:t>
         <w:br/>
         <w:t>├── config/assembly.xml                 deployment descriptor (component selection + properties)</w:t>
         <w:br/>
@@ -1702,7 +1702,7 @@
         <w:br/>
         <w:t>├── lib/                                optional third-party component (ZXing 3.5.3)</w:t>
         <w:br/>
-        <w:t>├── build.sh, run-*.sh, pom.xml         build and run tooling</w:t>
+        <w:t>├── pom.xml, README.md                  optional Maven build, project readme</w:t>
         <w:br/>
         <w:t>├── out/                                compiled classes, distribution JAR, generated artifacts</w:t>
         <w:br/>
@@ -1716,7 +1716,9 @@
         <w:br/>
         <w:t xml:space="preserve">    ├── screenshots/                    27 screenshots (code, GUI, console, introspection)</w:t>
         <w:br/>
-        <w:t xml:space="preserve">    └── evidence/                       verification transcript, CSVs, artifact gallery</w:t>
+        <w:t xml:space="preserve">    ├── evidence/                       verification transcript, CSVs, artifact gallery</w:t>
+        <w:br/>
+        <w:t xml:space="preserve">    └── report-tooling/                 helpers that produced the figures and screenshots</w:t>
       </w:r>
     </w:p>
     <w:p>
@@ -4675,16 +4677,7 @@
               <w:rPr>
                 <w:rFonts w:ascii="Consolas" w:hAnsi="Consolas"/>
               </w:rPr>
-              <w:t>./build.sh compile</w:t>
-            </w:r>
-            <w:r>
-              <w:t xml:space="preserve"> → </w:t>
-            </w:r>
-            <w:r>
-              <w:rPr>
-                <w:rFonts w:ascii="Consolas" w:hAnsi="Consolas"/>
-              </w:rPr>
-              <w:t>javac -d out/classes --release 11</w:t>
+              <w:t>javac -cp lib/core-3.5.3.jar -d out/classes src/main/java/ke/ku/sco310/qr/*/*.java</w:t>
             </w:r>
           </w:p>
         </w:tc>
@@ -4750,7 +4743,7 @@
               <w:rPr>
                 <w:rFonts w:ascii="Consolas" w:hAnsi="Consolas"/>
               </w:rPr>
-              <w:t>./build.sh jar</w:t>
+              <w:t>java -cp out/classes ke.ku.sco310.qr.tools.ProjectBuilder jar</w:t>
             </w:r>
             <w:r>
               <w:t xml:space="preserve"> → </w:t>
@@ -5840,7 +5833,7 @@
         <w:t>out/dist/qr-component-suite-1.0.0.jar</w:t>
       </w:r>
       <w:r>
-        <w:t xml:space="preserve"> — the deployable unit (117 KB, 51 classes) plus </w:t>
+        <w:t xml:space="preserve"> — the deployable unit (122 KB, 52 classes, 53 entries) plus </w:t>
       </w:r>
       <w:r>
         <w:rPr>
@@ -6545,17 +6538,28 @@
     </w:p>
     <w:p>
       <w:r>
-        <w:t>(</w:t>
+        <w:t xml:space="preserve">(the </w:t>
       </w:r>
       <w:r>
         <w:rPr>
           <w:rFonts w:ascii="Consolas" w:hAnsi="Consolas"/>
         </w:rPr>
-        <w:t>./run-cli.sh --inspect &lt;class&gt;</w:t>
-      </w:r>
-      <w:r>
-        <w:t xml:space="preserve">, see </w:t>
-      </w:r>
+        <w:t>--inspect</w:t>
+      </w:r>
+      <w:r>
+        <w:t xml:space="preserve"> option of the CLI assembly or the </w:t>
+      </w:r>
+      <w:r>
+        <w:rPr>
+          <w:rFonts w:ascii="Consolas" w:hAnsi="Consolas"/>
+        </w:rPr>
+        <w:t>BeanInspector</w:t>
+      </w:r>
+      <w:r>
+        <w:t xml:space="preserve"> class directly, see</w:t>
+      </w:r>
+    </w:p>
+    <w:p>
       <w:r>
         <w:rPr>
           <w:rFonts w:ascii="Consolas" w:hAnsi="Consolas"/>
@@ -17390,13 +17394,16 @@
     </w:p>
     <w:p>
       <w:r>
+        <w:t>instrumentation of the real engine (</w:t>
+      </w:r>
+      <w:r>
         <w:rPr>
           <w:rFonts w:ascii="Consolas" w:hAnsi="Consolas"/>
         </w:rPr>
-        <w:t>tools/MaskComparison.java</w:t>
-      </w:r>
-      <w:r>
-        <w:t>-style instrumentation of the real engine, and the tables are</w:t>
+        <w:t>ke.ku.sco310.qr.test.MaskComparisonTool</w:t>
+      </w:r>
+      <w:r>
+        <w:t>), and the tables are</w:t>
       </w:r>
     </w:p>
     <w:p>
@@ -22490,7 +22497,7 @@
               <w:rPr>
                 <w:rFonts w:ascii="Consolas" w:hAnsi="Consolas"/>
               </w:rPr>
-              <w:t>./run-cli.sh --help</w:t>
+              <w:t>java -cp out/classes:lib/* ke.ku.sco310.qr.cli.QrCliAssembly --help</w:t>
             </w:r>
           </w:p>
         </w:tc>
@@ -22531,7 +22538,7 @@
               <w:rPr>
                 <w:rFonts w:ascii="Consolas" w:hAnsi="Consolas"/>
               </w:rPr>
-              <w:t>./run-cli.sh --list-components</w:t>
+              <w:t>java -cp out/classes:lib/* ke.ku.sco310.qr.cli.QrCliAssembly --list-components</w:t>
             </w:r>
           </w:p>
         </w:tc>
@@ -22581,7 +22588,7 @@
               <w:rPr>
                 <w:rFonts w:ascii="Consolas" w:hAnsi="Consolas"/>
               </w:rPr>
-              <w:t>./run-cli.sh --text … --format png --show-assembly</w:t>
+              <w:t>java -cp out/classes:lib/* ke.ku.sco310.qr.cli.QrCliAssembly --text … --format png --show-assembly</w:t>
             </w:r>
           </w:p>
         </w:tc>
@@ -22622,7 +22629,7 @@
               <w:rPr>
                 <w:rFonts w:ascii="Consolas" w:hAnsi="Consolas"/>
               </w:rPr>
-              <w:t>./run-cli.sh --text "SCO310" --ec H --format ascii --ascii</w:t>
+              <w:t>java -cp out/classes:lib/* ke.ku.sco310.qr.cli.QrCliAssembly --text "SCO310" --ec H --format ascii --ascii</w:t>
             </w:r>
           </w:p>
         </w:tc>
@@ -22778,7 +22785,7 @@
               <w:rPr>
                 <w:rFonts w:ascii="Consolas" w:hAnsi="Consolas"/>
               </w:rPr>
-              <w:t>./run-tests.sh</w:t>
+              <w:t>java -cp out/classes ke.ku.sco310.qr.tools.ProjectBuilder test</w:t>
             </w:r>
           </w:p>
         </w:tc>
@@ -22825,7 +22832,7 @@
               <w:rPr>
                 <w:rFonts w:ascii="Consolas" w:hAnsi="Consolas"/>
               </w:rPr>
-              <w:t>./build.sh all</w:t>
+              <w:t>java -cp out/classes ke.ku.sco310.qr.tools.ProjectBuilder all</w:t>
             </w:r>
           </w:p>
         </w:tc>
@@ -22836,16 +22843,7 @@
           <w:p>
             <w:r/>
             <w:r>
-              <w:t xml:space="preserve">compile → verify → package, with the </w:t>
-            </w:r>
-            <w:r>
-              <w:rPr>
-                <w:rFonts w:ascii="Consolas" w:hAnsi="Consolas"/>
-              </w:rPr>
-              <w:t>Java-Bean: True</w:t>
-            </w:r>
-            <w:r>
-              <w:t xml:space="preserve"> manifest dump</w:t>
+              <w:t>compile → verify → package, driven entirely by Java</w:t>
             </w:r>
           </w:p>
         </w:tc>
@@ -22925,7 +22923,7 @@
               <w:rPr>
                 <w:rFonts w:ascii="Consolas" w:hAnsi="Consolas"/>
               </w:rPr>
-              <w:t>./run-web.sh --port 8210</w:t>
+              <w:t>java -cp out/classes:lib/* ke.ku.sco310.qr.web.QrHttpServiceComponent --port 8210</w:t>
             </w:r>
             <w:r>
               <w:t xml:space="preserve"> + </w:t>
@@ -23809,7 +23807,7 @@
         <w:rPr>
           <w:rFonts w:ascii="Consolas" w:hAnsi="Consolas"/>
         </w:rPr>
-        <w:t>./run-tests.sh</w:t>
+        <w:t>ProjectBuilder test</w:t>
       </w:r>
       <w:r>
         <w:t>. The harness records, for every check, the group, the name, the outcome, the</w:t>
@@ -26786,15 +26784,18 @@
         </w:rPr>
         <w:t>cd qr-component-studio</w:t>
         <w:br/>
-        <w:t>./build.sh all          # clean, compile, verify, compare, package</w:t>
+        <w:t>java -cp out/classes ke.ku.sco310.qr.tools.ProjectBuilder all     # clean, compile, verify, compare, package</w:t>
         <w:br/>
-        <w:t>./run-tests.sh          # verification only, rewrites docs/evidence/</w:t>
+        <w:t>java -cp out/classes ke.ku.sco310.qr.tools.ProjectBuilder test    # verification only, rewrites docs/evidence/</w:t>
         <w:br/>
-        <w:t>python3 tools/capture_screenshots.py   # regenerates docs/screenshots/ from the running programs</w:t>
         <w:br/>
-        <w:t>python3 tools/make_diagrams.py         # regenerates docs/diagrams/</w:t>
+        <w:t># the report images are regenerated by the documentation helpers kept in docs/report-tooling/</w:t>
         <w:br/>
-        <w:t>python3 tools/make_gallery.py          # regenerates the artifact contact sheet</w:t>
+        <w:t>python3 docs/report-tooling/capture_screenshots.py    # screenshots of the running programs</w:t>
+        <w:br/>
+        <w:t>python3 docs/report-tooling/make_diagrams.py          # the six figures</w:t>
+        <w:br/>
+        <w:t>python3 docs/report-tooling/make_gallery.py           # the artifact contact sheet</w:t>
       </w:r>
     </w:p>
     <w:p>
@@ -26866,9 +26867,9 @@
         <w:br/>
         <w:t>│   ├── event/           2 files - event object and listener interface</w:t>
         <w:br/>
-        <w:t>│   └── tools/           1 file  - BeanInspector introspection tool</w:t>
+        <w:t>│   └── tools/           2 files - the Java build tool and the BeanInspector introspection tool</w:t>
         <w:br/>
-        <w:t>├── src/test/java/ke/ku/sco310/qr/test/   7 files - in-house harness, oracle, suites, runner</w:t>
+        <w:t>├── src/test/java/ke/ku/sco310/qr/test/   8 files - harness, oracle, suites, runner, comparison tool</w:t>
         <w:br/>
         <w:t>├── config/assembly.xml           deployment descriptor</w:t>
         <w:br/>
@@ -26876,9 +26877,9 @@
         <w:br/>
         <w:t>├── lib/                          optional third-party component (ZXing 3.5.3)</w:t>
         <w:br/>
-        <w:t>├── tools/                        documentation builders and the mask-comparison instrument</w:t>
+        <w:t>├── pom.xml, README.md            optional Maven build, project readme</w:t>
         <w:br/>
-        <w:t>├── build.sh, run-*.sh, pom.xml   build and run tooling</w:t>
+        <w:t>├── .gitignore                    keeps out/ and editor noise out of version control</w:t>
         <w:br/>
         <w:t>├── out/                          classes, verification classes, distribution JAR, generated files</w:t>
         <w:br/>
@@ -26892,7 +26893,9 @@
         <w:br/>
         <w:t xml:space="preserve">    ├── screenshots/              27 screenshots of code and of running programs</w:t>
         <w:br/>
-        <w:t xml:space="preserve">    └── evidence/                 verification transcript, CSVs, artifact gallery, XML graph</w:t>
+        <w:t xml:space="preserve">    ├── evidence/                 verification transcript, CSVs, artifact gallery, XML graph</w:t>
+        <w:br/>
+        <w:t xml:space="preserve">    └── report-tooling/           helpers that produced the figures and the screenshots</w:t>
       </w:r>
     </w:p>
     <w:p>
@@ -26903,35 +26906,56 @@
         <w:rPr>
           <w:color w:val="1B5E20"/>
         </w:rPr>
-        <w:t>10.2 Build</w:t>
-      </w:r>
-    </w:p>
-    <w:p>
-      <w:r>
-        <w:t xml:space="preserve">The build is deliberately dependency-free: it uses </w:t>
-      </w:r>
+        <w:t>10.2 Build — pure Java, no scripts</w:t>
+      </w:r>
+    </w:p>
+    <w:p>
+      <w:r>
+        <w:t xml:space="preserve">The project contains </w:t>
+      </w:r>
+      <w:r>
+        <w:rPr>
+          <w:b/>
+        </w:rPr>
+        <w:t>no shell scripts, batch files or external build tool</w:t>
+      </w:r>
+      <w:r>
+        <w:t>. Everything the build</w:t>
+      </w:r>
+    </w:p>
+    <w:p>
+      <w:r>
+        <w:t>does is done by Java code:</w:t>
+      </w:r>
+    </w:p>
+    <w:p>
+      <w:pPr>
+        <w:pStyle w:val="ListBullet"/>
+      </w:pPr>
       <w:r>
         <w:rPr>
           <w:rFonts w:ascii="Consolas" w:hAnsi="Consolas"/>
         </w:rPr>
-        <w:t>javac</w:t>
-      </w:r>
-      <w:r>
-        <w:t xml:space="preserve"> directly (step 3 of the eight JavaBean</w:t>
-      </w:r>
-    </w:p>
-    <w:p>
-      <w:r>
-        <w:t xml:space="preserve">steps) and packages with </w:t>
-      </w:r>
+        <w:t>ke.ku.sco310.qr.tools.ProjectBuilder</w:t>
+      </w:r>
+      <w:r>
+        <w:t xml:space="preserve"> is the build tool. It drives</w:t>
+      </w:r>
+    </w:p>
+    <w:p>
       <w:r>
         <w:rPr>
           <w:rFonts w:ascii="Consolas" w:hAnsi="Consolas"/>
         </w:rPr>
-        <w:t>jar</w:t>
-      </w:r>
-      <w:r>
-        <w:t xml:space="preserve"> (steps 4–6). No Maven, Gradle or Ant is required, although a</w:t>
+        <w:t>javax.tools.JavaCompiler</w:t>
+      </w:r>
+      <w:r>
+        <w:t xml:space="preserve"> (the compiler API that ships with the JDK) to compile the sources,</w:t>
+      </w:r>
+    </w:p>
+    <w:p>
+      <w:r>
+        <w:t>launches the verification suite in a child JVM, and writes the deployable JAR with</w:t>
       </w:r>
     </w:p>
     <w:p>
@@ -26939,10 +26963,118 @@
         <w:rPr>
           <w:rFonts w:ascii="Consolas" w:hAnsi="Consolas"/>
         </w:rPr>
-        <w:t>pom.xml</w:t>
-      </w:r>
-      <w:r>
-        <w:t xml:space="preserve"> is included for environments that prefer it.</w:t>
+        <w:t>java.util.jar.JarOutputStream</w:t>
+      </w:r>
+      <w:r>
+        <w:t xml:space="preserve">, applying </w:t>
+      </w:r>
+      <w:r>
+        <w:rPr>
+          <w:rFonts w:ascii="Consolas" w:hAnsi="Consolas"/>
+        </w:rPr>
+        <w:t>manifest/MANIFEST.MF</w:t>
+      </w:r>
+      <w:r>
+        <w:t xml:space="preserve"> so that every bean keeps its</w:t>
+      </w:r>
+    </w:p>
+    <w:p>
+      <w:r>
+        <w:rPr>
+          <w:rFonts w:ascii="Consolas" w:hAnsi="Consolas"/>
+        </w:rPr>
+        <w:t>Java-Bean: True</w:t>
+      </w:r>
+      <w:r>
+        <w:t xml:space="preserve"> entry.</w:t>
+      </w:r>
+    </w:p>
+    <w:p>
+      <w:pPr>
+        <w:pStyle w:val="ListBullet"/>
+      </w:pPr>
+      <w:r>
+        <w:t xml:space="preserve">the three front ends, the introspection tool and the verification suite are ordinary </w:t>
+      </w:r>
+      <w:r>
+        <w:rPr>
+          <w:rFonts w:ascii="Consolas" w:hAnsi="Consolas"/>
+        </w:rPr>
+        <w:t>main</w:t>
+      </w:r>
+    </w:p>
+    <w:p>
+      <w:r>
+        <w:t xml:space="preserve">classes, run with </w:t>
+      </w:r>
+      <w:r>
+        <w:rPr>
+          <w:rFonts w:ascii="Consolas" w:hAnsi="Consolas"/>
+        </w:rPr>
+        <w:t>java -cp …</w:t>
+      </w:r>
+      <w:r>
+        <w:t>.</w:t>
+      </w:r>
+    </w:p>
+    <w:p>
+      <w:r>
+        <w:rPr>
+          <w:b/>
+        </w:rPr>
+        <w:t>Step 1 — bootstrap compile</w:t>
+      </w:r>
+      <w:r>
+        <w:t xml:space="preserve"> (one command; it produces the build tool itself together with the</w:t>
+      </w:r>
+    </w:p>
+    <w:p>
+      <w:r>
+        <w:t xml:space="preserve">components, because all main sources live one directory deep under </w:t>
+      </w:r>
+      <w:r>
+        <w:rPr>
+          <w:rFonts w:ascii="Consolas" w:hAnsi="Consolas"/>
+        </w:rPr>
+        <w:t>ke/ku/sco310/qr/</w:t>
+      </w:r>
+      <w:r>
+        <w:t>):</w:t>
+      </w:r>
+    </w:p>
+    <w:p>
+      <w:pPr>
+        <w:spacing w:before="80" w:after="160"/>
+      </w:pPr>
+      <w:r>
+        <w:rPr>
+          <w:rFonts w:ascii="Consolas" w:hAnsi="Consolas"/>
+          <w:sz w:val="16"/>
+        </w:rPr>
+        <w:t>javac -cp lib/core-3.5.3.jar -d out/classes src/main/java/ke/ku/sco310/qr/*/*.java</w:t>
+      </w:r>
+    </w:p>
+    <w:p>
+      <w:r>
+        <w:rPr>
+          <w:b/>
+        </w:rPr>
+        <w:t>Step 2 — everything else</w:t>
+      </w:r>
+      <w:r>
+        <w:t xml:space="preserve"> is a single Java command:</w:t>
+      </w:r>
+    </w:p>
+    <w:p>
+      <w:pPr>
+        <w:spacing w:before="80" w:after="160"/>
+      </w:pPr>
+      <w:r>
+        <w:rPr>
+          <w:rFonts w:ascii="Consolas" w:hAnsi="Consolas"/>
+          <w:sz w:val="16"/>
+        </w:rPr>
+        <w:t>java -cp out/classes ke.ku.sco310.qr.tools.ProjectBuilder all</w:t>
       </w:r>
     </w:p>
     <w:tbl>
@@ -26970,7 +27102,7 @@
               <w:rPr>
                 <w:b/>
               </w:rPr>
-              <w:t>Command</w:t>
+              <w:t>Target</w:t>
             </w:r>
           </w:p>
         </w:tc>
@@ -27004,7 +27136,7 @@
               <w:rPr>
                 <w:rFonts w:ascii="Consolas" w:hAnsi="Consolas"/>
               </w:rPr>
-              <w:t>./build.sh clean</w:t>
+              <w:t>ProjectBuilder clean</w:t>
             </w:r>
           </w:p>
         </w:tc>
@@ -27037,7 +27169,7 @@
               <w:rPr>
                 <w:rFonts w:ascii="Consolas" w:hAnsi="Consolas"/>
               </w:rPr>
-              <w:t>./build.sh compile</w:t>
+              <w:t>ProjectBuilder compile</w:t>
             </w:r>
           </w:p>
         </w:tc>
@@ -27048,13 +27180,16 @@
           <w:p>
             <w:r/>
             <w:r>
-              <w:t xml:space="preserve">compiles the main sources with </w:t>
-            </w:r>
-            <w:r>
-              <w:rPr>
-                <w:rFonts w:ascii="Consolas" w:hAnsi="Consolas"/>
-              </w:rPr>
-              <w:t>javac --release 11 -Xlint:all,-this-escape</w:t>
+              <w:t xml:space="preserve">compiles the main sources through the </w:t>
+            </w:r>
+            <w:r>
+              <w:rPr>
+                <w:rFonts w:ascii="Consolas" w:hAnsi="Consolas"/>
+              </w:rPr>
+              <w:t>JavaCompiler</w:t>
+            </w:r>
+            <w:r>
+              <w:t xml:space="preserve"> API</w:t>
             </w:r>
           </w:p>
         </w:tc>
@@ -27070,7 +27205,7 @@
               <w:rPr>
                 <w:rFonts w:ascii="Consolas" w:hAnsi="Consolas"/>
               </w:rPr>
-              <w:t>./build.sh test</w:t>
+              <w:t>ProjectBuilder test</w:t>
             </w:r>
           </w:p>
         </w:tc>
@@ -27103,7 +27238,7 @@
               <w:rPr>
                 <w:rFonts w:ascii="Consolas" w:hAnsi="Consolas"/>
               </w:rPr>
-              <w:t>./build.sh compare</w:t>
+              <w:t>ProjectBuilder compare</w:t>
             </w:r>
           </w:p>
         </w:tc>
@@ -27130,7 +27265,7 @@
               <w:rPr>
                 <w:rFonts w:ascii="Consolas" w:hAnsi="Consolas"/>
               </w:rPr>
-              <w:t>./build.sh jar</w:t>
+              <w:t>ProjectBuilder jar</w:t>
             </w:r>
           </w:p>
         </w:tc>
@@ -27166,7 +27301,7 @@
               <w:rPr>
                 <w:rFonts w:ascii="Consolas" w:hAnsi="Consolas"/>
               </w:rPr>
-              <w:t>./build.sh docs</w:t>
+              <w:t>ProjectBuilder all</w:t>
             </w:r>
           </w:p>
         </w:tc>
@@ -27177,88 +27312,7 @@
           <w:p>
             <w:r/>
             <w:r>
-              <w:t>regenerates the HTML, DOCX and PDF versions of this report</w:t>
-            </w:r>
-          </w:p>
-        </w:tc>
-      </w:tr>
-      <w:tr>
-        <w:tc>
-          <w:tcPr>
-            <w:tcW w:type="dxa" w:w="4320"/>
-          </w:tcPr>
-          <w:p>
-            <w:r/>
-            <w:r>
-              <w:rPr>
-                <w:rFonts w:ascii="Consolas" w:hAnsi="Consolas"/>
-              </w:rPr>
-              <w:t>./build.sh all</w:t>
-            </w:r>
-          </w:p>
-        </w:tc>
-        <w:tc>
-          <w:tcPr>
-            <w:tcW w:type="dxa" w:w="4320"/>
-          </w:tcPr>
-          <w:p>
-            <w:r/>
-            <w:r>
-              <w:t>clean → compile → verify → compare → package</w:t>
-            </w:r>
-          </w:p>
-        </w:tc>
-      </w:tr>
-      <w:tr>
-        <w:tc>
-          <w:tcPr>
-            <w:tcW w:type="dxa" w:w="4320"/>
-          </w:tcPr>
-          <w:p>
-            <w:r/>
-            <w:r>
-              <w:rPr>
-                <w:rFonts w:ascii="Consolas" w:hAnsi="Consolas"/>
-              </w:rPr>
-              <w:t>./run-tests.sh</w:t>
-            </w:r>
-            <w:r>
-              <w:t xml:space="preserve">, </w:t>
-            </w:r>
-            <w:r>
-              <w:rPr>
-                <w:rFonts w:ascii="Consolas" w:hAnsi="Consolas"/>
-              </w:rPr>
-              <w:t>./run-cli.sh</w:t>
-            </w:r>
-            <w:r>
-              <w:t xml:space="preserve">, </w:t>
-            </w:r>
-            <w:r>
-              <w:rPr>
-                <w:rFonts w:ascii="Consolas" w:hAnsi="Consolas"/>
-              </w:rPr>
-              <w:t>./run-gui.sh</w:t>
-            </w:r>
-            <w:r>
-              <w:t xml:space="preserve">, </w:t>
-            </w:r>
-            <w:r>
-              <w:rPr>
-                <w:rFonts w:ascii="Consolas" w:hAnsi="Consolas"/>
-              </w:rPr>
-              <w:t>./run-web.sh</w:t>
-            </w:r>
-          </w:p>
-        </w:tc>
-        <w:tc>
-          <w:tcPr>
-            <w:tcW w:type="dxa" w:w="4320"/>
-          </w:tcPr>
-          <w:p>
-            <w:r/>
-            <w:r>
-              <w:t>run the verification suite and the three front ends</w:t>
+              <w:t>clean → compile → verify → compare → package (the default target)</w:t>
             </w:r>
           </w:p>
         </w:tc>
@@ -27273,7 +27327,7 @@
         <w:rPr>
           <w:rFonts w:ascii="Consolas" w:hAnsi="Consolas"/>
         </w:rPr>
-        <w:t>./build.sh all</w:t>
+        <w:t>ProjectBuilder all</w:t>
       </w:r>
       <w:r>
         <w:t xml:space="preserve"> (abridged, with the counts that §9 relies on):</w:t>
@@ -27288,47 +27342,55 @@
           <w:rFonts w:ascii="Consolas" w:hAnsi="Consolas"/>
           <w:sz w:val="16"/>
         </w:rPr>
-        <w:t>[build] compiling main sources with javac (--release 11)</w:t>
+        <w:t>[build] compiling the verification suite</w:t>
         <w:br/>
-        <w:t>[build] main classes: 51</w:t>
+        <w:t>TOTAL 108 checks, 108 passed, 0 failed</w:t>
         <w:br/>
         <w:t>[evidence] wrote docs/evidence/test-report.txt (13448 chars)</w:t>
         <w:br/>
         <w:t>checks: 108, failures: 0</w:t>
         <w:br/>
-        <w:t>mask comparison written to docs/evidence/mask-selection-comparison.csv</w:t>
+        <w:t>[build] comparing the mask-selection stage with the independent ZXing encoder</w:t>
         <w:br/>
-        <w:t>[build] jar written: out/dist/qr-component-suite-1.0.0.jar (119980 bytes)</w:t>
+        <w:t>cases                       : 104</w:t>
+        <w:br/>
+        <w:t>[build] compiling main sources with the JavaCompiler API (--release 11)</w:t>
+        <w:br/>
+        <w:t>[build] main classes: 52</w:t>
+        <w:br/>
+        <w:t>[build] packaging the components into qr-component-suite-1.0.0.jar (manifest: manifest/MANIFEST.MF)</w:t>
+        <w:br/>
+        <w:t>[build] jar written: out/dist/qr-component-suite-1.0.0.jar (124565 bytes, 53 entries)</w:t>
         <w:br/>
         <w:t>[build] done</w:t>
       </w:r>
     </w:p>
     <w:p>
       <w:r>
-        <w:t xml:space="preserve">The compiler is configured with </w:t>
+        <w:t xml:space="preserve">The compiler is invoked with </w:t>
       </w:r>
       <w:r>
         <w:rPr>
           <w:rFonts w:ascii="Consolas" w:hAnsi="Consolas"/>
         </w:rPr>
+        <w:t>--release 11</w:t>
+      </w:r>
+      <w:r>
+        <w:t xml:space="preserve"> and </w:t>
+      </w:r>
+      <w:r>
+        <w:rPr>
+          <w:rFonts w:ascii="Consolas" w:hAnsi="Consolas"/>
+        </w:rPr>
         <w:t>-Xlint:all</w:t>
       </w:r>
       <w:r>
-        <w:t xml:space="preserve"> and the build produces </w:t>
-      </w:r>
-      <w:r>
-        <w:rPr>
-          <w:b/>
-        </w:rPr>
-        <w:t>no warnings</w:t>
-      </w:r>
-      <w:r>
-        <w:t>. The single</w:t>
-      </w:r>
-    </w:p>
-    <w:p>
-      <w:r>
-        <w:t xml:space="preserve">disabled category is </w:t>
+        <w:t>, and the build produces **no</w:t>
+      </w:r>
+    </w:p>
+    <w:p>
+      <w:r>
+        <w:t xml:space="preserve">warnings**. The single disabled category is </w:t>
       </w:r>
       <w:r>
         <w:rPr>
@@ -27337,35 +27399,64 @@
         <w:t>this-escape</w:t>
       </w:r>
       <w:r>
-        <w:t xml:space="preserve">, and the reason is documented in </w:t>
+        <w:t>, and the reason is written where the</w:t>
+      </w:r>
+    </w:p>
+    <w:p>
+      <w:r>
+        <w:t xml:space="preserve">option is set: the JavaBeans bound-property idiom requires </w:t>
       </w:r>
       <w:r>
         <w:rPr>
           <w:rFonts w:ascii="Consolas" w:hAnsi="Consolas"/>
         </w:rPr>
-        <w:t>build.sh</w:t>
-      </w:r>
-      <w:r>
-        <w:t>: the JavaBeans</w:t>
-      </w:r>
-    </w:p>
-    <w:p>
-      <w:r>
-        <w:t xml:space="preserve">bound-property idiom requires </w:t>
+        <w:t>new PropertyChangeSupport(this)</w:t>
+      </w:r>
+      <w:r>
+        <w:t xml:space="preserve"> in a</w:t>
+      </w:r>
+    </w:p>
+    <w:p>
+      <w:r>
+        <w:t>field initialiser, and that helper only stores the reference — it never calls back into the bean</w:t>
+      </w:r>
+    </w:p>
+    <w:p>
+      <w:r>
+        <w:t>during construction.</w:t>
+      </w:r>
+    </w:p>
+    <w:p>
+      <w:r>
+        <w:t xml:space="preserve">A </w:t>
       </w:r>
       <w:r>
         <w:rPr>
           <w:rFonts w:ascii="Consolas" w:hAnsi="Consolas"/>
         </w:rPr>
-        <w:t>new PropertyChangeSupport(this)</w:t>
-      </w:r>
-      <w:r>
-        <w:t xml:space="preserve"> in a field initialiser, and that</w:t>
-      </w:r>
-    </w:p>
-    <w:p>
-      <w:r>
-        <w:t>helper only stores the reference — it never calls back into the bean during construction.</w:t>
+        <w:t>pom.xml</w:t>
+      </w:r>
+      <w:r>
+        <w:t xml:space="preserve"> is included for teams that prefer a repository-managed build (</w:t>
+      </w:r>
+      <w:r>
+        <w:rPr>
+          <w:rFonts w:ascii="Consolas" w:hAnsi="Consolas"/>
+        </w:rPr>
+        <w:t>mvn package</w:t>
+      </w:r>
+      <w:r>
+        <w:t xml:space="preserve"> produces</w:t>
+      </w:r>
+    </w:p>
+    <w:p>
+      <w:r>
+        <w:t>the same JAR with the same manifest); the project does not need it, and no part of the project</w:t>
+      </w:r>
+    </w:p>
+    <w:p>
+      <w:r>
+        <w:t>depends on it.</w:t>
       </w:r>
     </w:p>
     <w:p>
@@ -27396,7 +27487,7 @@
           <w:rFonts w:ascii="Consolas" w:hAnsi="Consolas"/>
           <w:sz w:val="16"/>
         </w:rPr>
-        <w:t>./run-gui.sh</w:t>
+        <w:t>java -cp out/classes:lib/* ke.ku.sco310.qr.ui.QrStudioGuiAssembly</w:t>
         <w:br/>
         <w:t># or, for an automated capture of the real window:</w:t>
         <w:br/>
@@ -27422,15 +27513,15 @@
           <w:rFonts w:ascii="Consolas" w:hAnsi="Consolas"/>
           <w:sz w:val="16"/>
         </w:rPr>
-        <w:t>./run-cli.sh --text "https://www.ku.ac.ke/sco310" --ec M --format png --show-assembly</w:t>
+        <w:t>java -cp out/classes:lib/* ke.ku.sco310.qr.cli.QrCliAssembly --text "https://www.ku.ac.ke/sco310" --ec M --format png</w:t>
         <w:br/>
-        <w:t>./run-cli.sh --list-components            # the component catalogue with provided/required interfaces</w:t>
+        <w:t>java -cp out/classes:lib/* ke.ku.sco310.qr.cli.QrCliAssembly --list-components</w:t>
         <w:br/>
-        <w:t>./run-cli.sh --inspect ke.ku.sco310.qr.store.QrHistoryBean</w:t>
+        <w:t>java -cp out/classes:lib/* ke.ku.sco310.qr.cli.QrCliAssembly --inspect ke.ku.sco310.qr.store.QrHistoryBean</w:t>
         <w:br/>
-        <w:t>./run-cli.sh --text "SCO310" --format svg --save-assembly out/assembly-mine.xml</w:t>
+        <w:t>java -cp out/classes:lib/* ke.ku.sco310.qr.cli.QrCliAssembly --text "SCO310" --format svg --save-assembly out/assembly-mine.xml</w:t>
         <w:br/>
-        <w:t>./run-cli.sh --load-assembly out/assembly-mine.xml --format ascii --ascii</w:t>
+        <w:t>java -cp out/classes:lib/* ke.ku.sco310.qr.cli.QrCliAssembly --load-assembly out/assembly-mine.xml --format ascii --ascii</w:t>
       </w:r>
     </w:p>
     <w:p>
@@ -27450,7 +27541,7 @@
           <w:rFonts w:ascii="Consolas" w:hAnsi="Consolas"/>
           <w:sz w:val="16"/>
         </w:rPr>
-        <w:t>./run-web.sh --port 8099</w:t>
+        <w:t>java -cp out/classes:lib/* ke.ku.sco310.qr.web.QrHttpServiceComponent --port 8099</w:t>
         <w:br/>
         <w:t>curl 'http://localhost:8099/qr?text=HELLO%20WORLD&amp;ec=Q&amp;format=png&amp;moduleSize=8' -o hello.png</w:t>
         <w:br/>
@@ -27985,7 +28076,7 @@
               <w:rPr>
                 <w:rFonts w:ascii="Consolas" w:hAnsi="Consolas"/>
               </w:rPr>
-              <w:t>docs/documentation.md</w:t>
+              <w:t>docs/Documentation.md</w:t>
             </w:r>
             <w:r>
               <w:t xml:space="preserve">, </w:t>
@@ -28044,7 +28135,7 @@
               <w:rPr>
                 <w:rFonts w:ascii="Consolas" w:hAnsi="Consolas"/>
               </w:rPr>
-              <w:t>build.sh</w:t>
+              <w:t>ProjectBuilder</w:t>
             </w:r>
           </w:p>
         </w:tc>
@@ -29947,7 +30038,7 @@
         <w:rPr>
           <w:rFonts w:ascii="Consolas" w:hAnsi="Consolas"/>
         </w:rPr>
-        <w:t>./run-cli.sh --inspect &lt;class&gt;</w:t>
+        <w:t>java -cp out/classes:lib/* ke.ku.sco310.qr.cli.QrCliAssembly --inspect &lt;class&gt;</w:t>
       </w:r>
       <w:r>
         <w:t xml:space="preserve"> demonstrates steps 3–6 and 8 on the compiled bytecode.</w:t>

</xml_diff>

<commit_message>
Add standalone JAR, simplify GUI, clean evidence
</commit_message>
<xml_diff>
--- a/docs/SCO310-QR-Component-Suite-Report.docx
+++ b/docs/SCO310-QR-Component-Suite-Report.docx
@@ -292,7 +292,7 @@
               <w:t>qr-component-suite/</w:t>
             </w:r>
             <w:r>
-              <w:t xml:space="preserve"> (49 Java source files, 6 844 lines; 52 compiled classes)</w:t>
+              <w:t xml:space="preserve"> (48 Java source files, 6 581 lines; 51 compiled classes)</w:t>
             </w:r>
           </w:p>
         </w:tc>
@@ -560,7 +560,7 @@
           <w:p>
             <w:r/>
             <w:r>
-              <w:t>the composition pipeline, three front ends from one component set, replaceability, persistence of the assembly</w:t>
+              <w:t>the composition pipeline, two front ends from one component set, replaceability, persistence of the assembly</w:t>
             </w:r>
           </w:p>
         </w:tc>
@@ -793,17 +793,17 @@
     </w:p>
     <w:p>
       <w:r>
-        <w:t>component registry, configured by a deployment descriptor, and consumed by **three different</w:t>
-      </w:r>
-    </w:p>
-    <w:p>
-      <w:r>
-        <w:t>front-end assemblies** — a Swing desktop application, a command-line tool and an HTTP web</w:t>
-      </w:r>
-    </w:p>
-    <w:p>
-      <w:r>
-        <w:t xml:space="preserve">service — all built from the </w:t>
+        <w:t>component registry, configured by a deployment descriptor, and consumed by **two different</w:t>
+      </w:r>
+    </w:p>
+    <w:p>
+      <w:r>
+        <w:t>front-end assemblies** — a Swing desktop application and an HTTP web service — both built from</w:t>
+      </w:r>
+    </w:p>
+    <w:p>
+      <w:r>
+        <w:t xml:space="preserve">the </w:t>
       </w:r>
       <w:r>
         <w:rPr>
@@ -1217,7 +1217,7 @@
           <w:p>
             <w:r/>
             <w:r>
-              <w:t>6 844 lines of Java across 49 files, 0 external dependency for the engine</w:t>
+              <w:t>6 581 lines of Java across 48 files, 0 external dependency for the engine</w:t>
             </w:r>
           </w:p>
         </w:tc>
@@ -1310,7 +1310,7 @@
         <w:pStyle w:val="ListNumber"/>
       </w:pPr>
       <w:r>
-        <w:t>is usable from a desktop GUI, a command line and an HTTP endpoint;</w:t>
+        <w:t>is usable from a desktop GUI and an HTTP endpoint;</w:t>
       </w:r>
     </w:p>
     <w:p>
@@ -1514,7 +1514,7 @@
           <w:p>
             <w:r/>
             <w:r>
-              <w:t>two encoder components, three renderer components, three assemblies</w:t>
+              <w:t>two encoder components, three renderer components, two assemblies</w:t>
             </w:r>
           </w:p>
         </w:tc>
@@ -1531,7 +1531,7 @@
               <w:rPr>
                 <w:rFonts w:ascii="Consolas" w:hAnsi="Consolas"/>
               </w:rPr>
-              <w:t>docs/screenshots/07-cli-component-catalogue.png</w:t>
+              <w:t>docs/screenshots/03-gui-png-assembly.png</w:t>
             </w:r>
           </w:p>
         </w:tc>
@@ -1692,7 +1692,7 @@
         </w:rPr>
         <w:t>qr-component-studio/</w:t>
         <w:br/>
-        <w:t>├── src/main/java/ke/ku/sco310/qr/     49 Java sources: components, engine, front ends, build tool</w:t>
+        <w:t>├── src/main/java/ke/ku/sco310/qr/     48 Java sources: components, engine, front ends, build tool</w:t>
         <w:br/>
         <w:t>├── src/test/java/ke/ku/sco310/qr/test/ verification suite (8 files)</w:t>
         <w:br/>
@@ -1704,6 +1704,8 @@
         <w:br/>
         <w:t>├── pom.xml, README.md                  optional Maven build, project readme</w:t>
         <w:br/>
+        <w:t>├── QrStudio.jar                        standalone desktop application (double-click / java -jar)</w:t>
+        <w:br/>
         <w:t>├── out/                                compiled classes, distribution JAR, generated artifacts</w:t>
         <w:br/>
         <w:t>└── docs/</w:t>
@@ -1714,7 +1716,7 @@
         <w:br/>
         <w:t xml:space="preserve">    ├── diagrams/                       six generated figures</w:t>
         <w:br/>
-        <w:t xml:space="preserve">    ├── screenshots/                    27 screenshots (code, GUI, console, introspection)</w:t>
+        <w:t xml:space="preserve">    ├── screenshots/                    22 screenshots (code, GUI, web service, introspection)</w:t>
         <w:br/>
         <w:t xml:space="preserve">    ├── evidence/                       verification transcript, CSVs, artifact gallery</w:t>
         <w:br/>
@@ -3095,13 +3097,16 @@
     <w:p/>
     <w:p>
       <w:r>
+        <w:t xml:space="preserve">The same catalogue is held by </w:t>
+      </w:r>
+      <w:r>
         <w:rPr>
           <w:rFonts w:ascii="Consolas" w:hAnsi="Consolas"/>
         </w:rPr>
-        <w:t>ComponentRegistry.listComponents()</w:t>
-      </w:r>
-      <w:r>
-        <w:t xml:space="preserve"> prints exactly this table at run time — see</w:t>
+        <w:t>ComponentRegistry</w:t>
+      </w:r>
+      <w:r>
+        <w:t xml:space="preserve"> and is visible in the registry source listing,</w:t>
       </w:r>
     </w:p>
     <w:p>
@@ -3109,7 +3114,7 @@
         <w:rPr>
           <w:rFonts w:ascii="Consolas" w:hAnsi="Consolas"/>
         </w:rPr>
-        <w:t>docs/screenshots/07-cli-component-catalogue.png</w:t>
+        <w:t>docs/screenshots/20-code-registry.png</w:t>
       </w:r>
       <w:r>
         <w:t>.</w:t>
@@ -3295,7 +3300,7 @@
           <w:p>
             <w:r/>
             <w:r>
-              <w:t>The same nine components are used by three assemblies with three different user interfaces, and the renderers are reused inside the HTTP service per request.</w:t>
+              <w:t>The same nine components are used by two assemblies with two different user interfaces, and the renderers are reused inside the HTTP service per request.</w:t>
             </w:r>
           </w:p>
         </w:tc>
@@ -3650,7 +3655,7 @@
               <w:t>PureJavaQrEncoderBean</w:t>
             </w:r>
             <w:r>
-              <w:t xml:space="preserve"> is dropped into three assemblies untouched</w:t>
+              <w:t xml:space="preserve"> is dropped into two assemblies untouched</w:t>
             </w:r>
           </w:p>
         </w:tc>
@@ -3947,7 +3952,7 @@
     </w:p>
     <w:p>
       <w:r>
-        <w:t>renderer component behaves identically in the GUI, the CLI and the web service.</w:t>
+        <w:t>renderer component behaves identically in the GUI and the web service.</w:t>
       </w:r>
     </w:p>
     <w:p>
@@ -5830,10 +5835,43 @@
         <w:rPr>
           <w:rFonts w:ascii="Consolas" w:hAnsi="Consolas"/>
         </w:rPr>
+        <w:t>QrStudio.jar</w:t>
+      </w:r>
+      <w:r>
+        <w:t xml:space="preserve"> — the standalone desktop application (component classes plus the optional ZXing</w:t>
+      </w:r>
+    </w:p>
+    <w:p>
+      <w:r>
+        <w:t xml:space="preserve">classes, so it runs without a </w:t>
+      </w:r>
+      <w:r>
+        <w:rPr>
+          <w:rFonts w:ascii="Consolas" w:hAnsi="Consolas"/>
+        </w:rPr>
+        <w:t>lib/</w:t>
+      </w:r>
+      <w:r>
+        <w:t xml:space="preserve"> folder);</w:t>
+      </w:r>
+    </w:p>
+    <w:p>
+      <w:pPr>
+        <w:pStyle w:val="ListBullet"/>
+      </w:pPr>
+      <w:r>
+        <w:rPr>
+          <w:rFonts w:ascii="Consolas" w:hAnsi="Consolas"/>
+        </w:rPr>
         <w:t>out/dist/qr-component-suite-1.0.0.jar</w:t>
       </w:r>
       <w:r>
-        <w:t xml:space="preserve"> — the deployable unit (122 KB, 52 classes, 53 entries) plus </w:t>
+        <w:t xml:space="preserve"> — the thin deployable unit (118 KB, 51 component</w:t>
+      </w:r>
+    </w:p>
+    <w:p>
+      <w:r>
+        <w:t xml:space="preserve">classes, 52 entries) plus </w:t>
       </w:r>
       <w:r>
         <w:rPr>
@@ -5841,10 +5879,8 @@
         </w:rPr>
         <w:t>lib/</w:t>
       </w:r>
-    </w:p>
-    <w:p>
-      <w:r>
-        <w:t>for the optional ZXing component;</w:t>
+      <w:r>
+        <w:t xml:space="preserve"> for the optional ZXing component;</w:t>
       </w:r>
     </w:p>
     <w:p>
@@ -6539,15 +6575,6 @@
     <w:p>
       <w:r>
         <w:t xml:space="preserve">(the </w:t>
-      </w:r>
-      <w:r>
-        <w:rPr>
-          <w:rFonts w:ascii="Consolas" w:hAnsi="Consolas"/>
-        </w:rPr>
-        <w:t>--inspect</w:t>
-      </w:r>
-      <w:r>
-        <w:t xml:space="preserve"> option of the CLI assembly or the </w:t>
       </w:r>
       <w:r>
         <w:rPr>
@@ -7540,7 +7567,7 @@
         <w:t>ComponentRegistry.listComponents()</w:t>
       </w:r>
       <w:r>
-        <w:t xml:space="preserve"> prints this catalogue at run time together with the state of</w:t>
+        <w:t xml:space="preserve"> builds this catalogue at run time together with the state of</w:t>
       </w:r>
     </w:p>
     <w:p>
@@ -7556,13 +7583,13 @@
     </w:p>
     <w:p>
       <w:r>
-        <w:t>(</w:t>
+        <w:t xml:space="preserve">(see the registry source listing, </w:t>
       </w:r>
       <w:r>
         <w:rPr>
           <w:rFonts w:ascii="Consolas" w:hAnsi="Consolas"/>
         </w:rPr>
-        <w:t>docs/screenshots/07-cli-component-catalogue.png</w:t>
+        <w:t>docs/screenshots/20-code-registry.png</w:t>
       </w:r>
       <w:r>
         <w:t>).</w:t>
@@ -15908,7 +15935,7 @@
     </w:p>
     <w:p>
       <w:r>
-        <w:t>The same file generates the deployment report printed at start-up by all three front ends:</w:t>
+        <w:t>The same file generates the deployment report printed at start-up by both front ends:</w:t>
       </w:r>
     </w:p>
     <w:p>
@@ -15935,7 +15962,7 @@
         <w:rPr>
           <w:color w:val="1B5E20"/>
         </w:rPr>
-        <w:t>6.2 Three front ends, one component set</w:t>
+        <w:t>6.2 Two front ends, one component set</w:t>
       </w:r>
     </w:p>
     <w:tbl>
@@ -16069,7 +16096,7 @@
           <w:p>
             <w:r/>
             <w:r>
-              <w:t>a property sheet that edits the live components, a preview that follows bound-property changes, an indexed history view</w:t>
+              <w:t>a compact form for the payload and output format, a preview that follows renderer replacement, an indexed history view</w:t>
             </w:r>
           </w:p>
         </w:tc>
@@ -16084,88 +16111,6 @@
                 <w:rFonts w:ascii="Consolas" w:hAnsi="Consolas"/>
               </w:rPr>
               <w:t>docs/screenshots/03/04/05-gui-*-assembly.png</w:t>
-            </w:r>
-          </w:p>
-        </w:tc>
-      </w:tr>
-      <w:tr>
-        <w:tc>
-          <w:tcPr>
-            <w:tcW w:type="dxa" w:w="2160"/>
-          </w:tcPr>
-          <w:p>
-            <w:r/>
-            <w:r>
-              <w:rPr>
-                <w:b/>
-              </w:rPr>
-              <w:t>Command line</w:t>
-            </w:r>
-          </w:p>
-        </w:tc>
-        <w:tc>
-          <w:tcPr>
-            <w:tcW w:type="dxa" w:w="2160"/>
-          </w:tcPr>
-          <w:p>
-            <w:r/>
-            <w:r>
-              <w:rPr>
-                <w:rFonts w:ascii="Consolas" w:hAnsi="Consolas"/>
-              </w:rPr>
-              <w:t>cli/QrCliAssembly</w:t>
-            </w:r>
-          </w:p>
-        </w:tc>
-        <w:tc>
-          <w:tcPr>
-            <w:tcW w:type="dxa" w:w="2160"/>
-          </w:tcPr>
-          <w:p>
-            <w:r/>
-            <w:r>
-              <w:t>batch generation, catalogue listing, introspection, XML graph save/load, ASCII preview</w:t>
-            </w:r>
-          </w:p>
-        </w:tc>
-        <w:tc>
-          <w:tcPr>
-            <w:tcW w:type="dxa" w:w="2160"/>
-          </w:tcPr>
-          <w:p>
-            <w:r/>
-            <w:r>
-              <w:rPr>
-                <w:rFonts w:ascii="Consolas" w:hAnsi="Consolas"/>
-              </w:rPr>
-              <w:t>docs/screenshots/06-cli-help.png</w:t>
-            </w:r>
-            <w:r>
-              <w:t xml:space="preserve">, </w:t>
-            </w:r>
-            <w:r>
-              <w:rPr>
-                <w:rFonts w:ascii="Consolas" w:hAnsi="Consolas"/>
-              </w:rPr>
-              <w:t>07</w:t>
-            </w:r>
-            <w:r>
-              <w:t xml:space="preserve">, </w:t>
-            </w:r>
-            <w:r>
-              <w:rPr>
-                <w:rFonts w:ascii="Consolas" w:hAnsi="Consolas"/>
-              </w:rPr>
-              <w:t>08</w:t>
-            </w:r>
-            <w:r>
-              <w:t xml:space="preserve">, </w:t>
-            </w:r>
-            <w:r>
-              <w:rPr>
-                <w:rFonts w:ascii="Consolas" w:hAnsi="Consolas"/>
-              </w:rPr>
-              <w:t>09</w:t>
             </w:r>
           </w:p>
         </w:tc>
@@ -16229,7 +16174,7 @@
     <w:p/>
     <w:p>
       <w:r>
-        <w:t xml:space="preserve">The three front ends contain </w:t>
+        <w:t xml:space="preserve">The two front ends contain </w:t>
       </w:r>
       <w:r>
         <w:rPr>
@@ -16283,24 +16228,7 @@
         <w:t>frame.propertyChange(...)</w:t>
       </w:r>
       <w:r>
-        <w:t xml:space="preserve"> refreshes the preview when </w:t>
-      </w:r>
-      <w:r>
-        <w:rPr>
-          <w:rFonts w:ascii="Consolas" w:hAnsi="Consolas"/>
-        </w:rPr>
-        <w:t>moduleSize</w:t>
-      </w:r>
-      <w:r>
-        <w:t xml:space="preserve"> changes);</w:t>
-      </w:r>
-    </w:p>
-    <w:p>
-      <w:pPr>
-        <w:pStyle w:val="ListBullet"/>
-      </w:pPr>
-      <w:r>
-        <w:t>the CLI parses arguments and calls the same facade;</w:t>
+        <w:t xml:space="preserve"> refreshes the preview when the renderer reports a property change);</w:t>
       </w:r>
     </w:p>
     <w:p>
@@ -16647,7 +16575,7 @@
         <w:rPr>
           <w:i/>
         </w:rPr>
-        <w:t>Renderer component</w:t>
+        <w:t>Output format</w:t>
       </w:r>
       <w:r>
         <w:t xml:space="preserve"> combo</w:t>
@@ -16975,15 +16903,6 @@
               </w:rPr>
               <w:t>Payload</w:t>
             </w:r>
-            <w:r>
-              <w:t xml:space="preserve">, </w:t>
-            </w:r>
-            <w:r>
-              <w:rPr>
-                <w:i/>
-              </w:rPr>
-              <w:t>Error correction</w:t>
-            </w:r>
           </w:p>
         </w:tc>
         <w:tc>
@@ -16993,13 +16912,22 @@
           <w:p>
             <w:r/>
             <w:r>
-              <w:t xml:space="preserve">inputs to </w:t>
-            </w:r>
-            <w:r>
-              <w:rPr>
-                <w:rFonts w:ascii="Consolas" w:hAnsi="Consolas"/>
-              </w:rPr>
-              <w:t>facade.generate(text, level)</w:t>
+              <w:t xml:space="preserve">input to </w:t>
+            </w:r>
+            <w:r>
+              <w:rPr>
+                <w:rFonts w:ascii="Consolas" w:hAnsi="Consolas"/>
+              </w:rPr>
+              <w:t>facade.generate(...)</w:t>
+            </w:r>
+            <w:r>
+              <w:t xml:space="preserve">; the error-correction level is the one configured in </w:t>
+            </w:r>
+            <w:r>
+              <w:rPr>
+                <w:rFonts w:ascii="Consolas" w:hAnsi="Consolas"/>
+              </w:rPr>
+              <w:t>assembly.xml</w:t>
             </w:r>
           </w:p>
         </w:tc>
@@ -17015,7 +16943,7 @@
               <w:rPr>
                 <w:i/>
               </w:rPr>
-              <w:t>Renderer component</w:t>
+              <w:t>Output format</w:t>
             </w:r>
             <w:r>
               <w:t xml:space="preserve"> combo box</w:t>
@@ -17066,10 +16994,16 @@
               <w:rPr>
                 <w:i/>
               </w:rPr>
-              <w:t>Module size (px)</w:t>
-            </w:r>
-            <w:r>
-              <w:t xml:space="preserve"> spinner</w:t>
+              <w:t>Generate</w:t>
+            </w:r>
+            <w:r>
+              <w:t xml:space="preserve"> / </w:t>
+            </w:r>
+            <w:r>
+              <w:rPr>
+                <w:i/>
+              </w:rPr>
+              <w:t>Save as…</w:t>
             </w:r>
           </w:p>
         </w:tc>
@@ -17080,22 +17014,19 @@
           <w:p>
             <w:r/>
             <w:r>
-              <w:t xml:space="preserve">the bound </w:t>
-            </w:r>
-            <w:r>
-              <w:rPr>
-                <w:rFonts w:ascii="Consolas" w:hAnsi="Consolas"/>
-              </w:rPr>
-              <w:t>moduleSize</w:t>
-            </w:r>
-            <w:r>
-              <w:t xml:space="preserve"> property of the active renderer; the preview updates through </w:t>
-            </w:r>
-            <w:r>
-              <w:rPr>
-                <w:rFonts w:ascii="Consolas" w:hAnsi="Consolas"/>
-              </w:rPr>
-              <w:t>PropertyChangeEvent</w:t>
+              <w:rPr>
+                <w:rFonts w:ascii="Consolas" w:hAnsi="Consolas"/>
+              </w:rPr>
+              <w:t>facade.generate(...)</w:t>
+            </w:r>
+            <w:r>
+              <w:t xml:space="preserve"> / </w:t>
+            </w:r>
+            <w:r>
+              <w:rPr>
+                <w:rFonts w:ascii="Consolas" w:hAnsi="Consolas"/>
+              </w:rPr>
+              <w:t>facade.renderWith(...)</w:t>
             </w:r>
           </w:p>
         </w:tc>
@@ -17111,10 +17042,10 @@
               <w:rPr>
                 <w:i/>
               </w:rPr>
-              <w:t>Foreground / background</w:t>
-            </w:r>
-            <w:r>
-              <w:t xml:space="preserve"> fields</w:t>
+              <w:t>Rendered artifact</w:t>
+            </w:r>
+            <w:r>
+              <w:t xml:space="preserve"> panel</w:t>
             </w:r>
           </w:p>
         </w:tc>
@@ -17125,28 +17056,25 @@
           <w:p>
             <w:r/>
             <w:r>
-              <w:rPr>
-                <w:rFonts w:ascii="Consolas" w:hAnsi="Consolas"/>
-              </w:rPr>
-              <w:t>foregroundColor</w:t>
-            </w:r>
-            <w:r>
-              <w:t xml:space="preserve"> / </w:t>
-            </w:r>
-            <w:r>
-              <w:rPr>
-                <w:rFonts w:ascii="Consolas" w:hAnsi="Consolas"/>
-              </w:rPr>
-              <w:t>backgroundColor</w:t>
-            </w:r>
-            <w:r>
-              <w:t xml:space="preserve">, parsed by </w:t>
-            </w:r>
-            <w:r>
-              <w:rPr>
-                <w:rFonts w:ascii="Consolas" w:hAnsi="Consolas"/>
-              </w:rPr>
-              <w:t>HexColorPropertyEditor.fromHex</w:t>
+              <w:t xml:space="preserve">the </w:t>
+            </w:r>
+            <w:r>
+              <w:rPr>
+                <w:rFonts w:ascii="Consolas" w:hAnsi="Consolas"/>
+              </w:rPr>
+              <w:t>RenderedArtifact</w:t>
+            </w:r>
+            <w:r>
+              <w:t xml:space="preserve"> returned by the renderer component; PNG and SVG are previewed as images (the SVG preview is rasterised through the PNG renderer, while </w:t>
+            </w:r>
+            <w:r>
+              <w:rPr>
+                <w:i/>
+              </w:rPr>
+              <w:t>Save as…</w:t>
+            </w:r>
+            <w:r>
+              <w:t xml:space="preserve"> writes the SVG source), and the image is scaled to fit with nearest-neighbour interpolation so the module edges stay crisp</w:t>
             </w:r>
           </w:p>
         </w:tc>
@@ -17162,94 +17090,7 @@
               <w:rPr>
                 <w:i/>
               </w:rPr>
-              <w:t>Generate</w:t>
-            </w:r>
-            <w:r>
-              <w:t xml:space="preserve"> / </w:t>
-            </w:r>
-            <w:r>
-              <w:rPr>
-                <w:i/>
-              </w:rPr>
-              <w:t>Save artifact as…</w:t>
-            </w:r>
-          </w:p>
-        </w:tc>
-        <w:tc>
-          <w:tcPr>
-            <w:tcW w:type="dxa" w:w="4320"/>
-          </w:tcPr>
-          <w:p>
-            <w:r/>
-            <w:r>
-              <w:rPr>
-                <w:rFonts w:ascii="Consolas" w:hAnsi="Consolas"/>
-              </w:rPr>
-              <w:t>facade.generate(...)</w:t>
-            </w:r>
-            <w:r>
-              <w:t xml:space="preserve"> / </w:t>
-            </w:r>
-            <w:r>
-              <w:rPr>
-                <w:rFonts w:ascii="Consolas" w:hAnsi="Consolas"/>
-              </w:rPr>
-              <w:t>facade.renderWith(...)</w:t>
-            </w:r>
-          </w:p>
-        </w:tc>
-      </w:tr>
-      <w:tr>
-        <w:tc>
-          <w:tcPr>
-            <w:tcW w:type="dxa" w:w="4320"/>
-          </w:tcPr>
-          <w:p>
-            <w:r/>
-            <w:r>
-              <w:rPr>
-                <w:i/>
-              </w:rPr>
-              <w:t>Rendered artifact</w:t>
-            </w:r>
-            <w:r>
-              <w:t xml:space="preserve"> panel</w:t>
-            </w:r>
-          </w:p>
-        </w:tc>
-        <w:tc>
-          <w:tcPr>
-            <w:tcW w:type="dxa" w:w="4320"/>
-          </w:tcPr>
-          <w:p>
-            <w:r/>
-            <w:r>
-              <w:t xml:space="preserve">the </w:t>
-            </w:r>
-            <w:r>
-              <w:rPr>
-                <w:rFonts w:ascii="Consolas" w:hAnsi="Consolas"/>
-              </w:rPr>
-              <w:t>RenderedArtifact</w:t>
-            </w:r>
-            <w:r>
-              <w:t xml:space="preserve"> returned by the renderer component; the image is scaled to fit with nearest-neighbour interpolation so the module edges stay crisp</w:t>
-            </w:r>
-          </w:p>
-        </w:tc>
-      </w:tr>
-      <w:tr>
-        <w:tc>
-          <w:tcPr>
-            <w:tcW w:type="dxa" w:w="4320"/>
-          </w:tcPr>
-          <w:p>
-            <w:r/>
-            <w:r>
-              <w:rPr>
-                <w:i/>
-              </w:rPr>
-              <w:t>History component (indexed property)</w:t>
+              <w:t>History</w:t>
             </w:r>
             <w:r>
               <w:t xml:space="preserve"> panel</w:t>
@@ -17340,12 +17181,12 @@
         <w:t>live view of the component graph</w:t>
       </w:r>
       <w:r>
-        <w:t>: editing a</w:t>
-      </w:r>
-    </w:p>
-    <w:p>
-      <w:r>
-        <w:t>property in the property sheet is what redraws the artifact.</w:t>
+        <w:t>: replacing</w:t>
+      </w:r>
+    </w:p>
+    <w:p>
+      <w:r>
+        <w:t>the renderer component redraws the artifact, and every generation updates the history.</w:t>
       </w:r>
     </w:p>
     <w:p>
@@ -22135,48 +21976,7 @@
           <w:p>
             <w:r/>
             <w:r>
-              <w:t>the front end: bound-property listeners, live preview</w:t>
-            </w:r>
-          </w:p>
-        </w:tc>
-      </w:tr>
-      <w:tr>
-        <w:tc>
-          <w:tcPr>
-            <w:tcW w:type="dxa" w:w="2880"/>
-          </w:tcPr>
-          <w:p>
-            <w:r/>
-            <w:r>
-              <w:rPr>
-                <w:rFonts w:ascii="Consolas" w:hAnsi="Consolas"/>
-              </w:rPr>
-              <w:t>23-code-cli-assembly.png</w:t>
-            </w:r>
-          </w:p>
-        </w:tc>
-        <w:tc>
-          <w:tcPr>
-            <w:tcW w:type="dxa" w:w="2880"/>
-          </w:tcPr>
-          <w:p>
-            <w:r/>
-            <w:r>
-              <w:rPr>
-                <w:rFonts w:ascii="Consolas" w:hAnsi="Consolas"/>
-              </w:rPr>
-              <w:t>cli/QrCliAssembly.java</w:t>
-            </w:r>
-          </w:p>
-        </w:tc>
-        <w:tc>
-          <w:tcPr>
-            <w:tcW w:type="dxa" w:w="2880"/>
-          </w:tcPr>
-          <w:p>
-            <w:r/>
-            <w:r>
-              <w:t>the batch front end and its option handling</w:t>
+              <w:t>the desktop front end: bound-property listeners, live preview</w:t>
             </w:r>
           </w:p>
         </w:tc>
@@ -22379,7 +22179,7 @@
           <w:p>
             <w:r/>
             <w:r>
-              <w:t>property sheet, live PNG preview, indexed history, symbol identity in the status bar</w:t>
+              <w:t>payload and format controls, live PNG preview, indexed history, symbol identity in the status bar</w:t>
             </w:r>
           </w:p>
         </w:tc>
@@ -22468,179 +22268,6 @@
             <w:r/>
             <w:r>
               <w:t>a textual artifact rendered into the same preview panel (card switch)</w:t>
-            </w:r>
-          </w:p>
-        </w:tc>
-      </w:tr>
-      <w:tr>
-        <w:tc>
-          <w:tcPr>
-            <w:tcW w:type="dxa" w:w="2880"/>
-          </w:tcPr>
-          <w:p>
-            <w:r/>
-            <w:r>
-              <w:rPr>
-                <w:rFonts w:ascii="Consolas" w:hAnsi="Consolas"/>
-              </w:rPr>
-              <w:t>06-cli-help.png</w:t>
-            </w:r>
-          </w:p>
-        </w:tc>
-        <w:tc>
-          <w:tcPr>
-            <w:tcW w:type="dxa" w:w="2880"/>
-          </w:tcPr>
-          <w:p>
-            <w:r/>
-            <w:r>
-              <w:rPr>
-                <w:rFonts w:ascii="Consolas" w:hAnsi="Consolas"/>
-              </w:rPr>
-              <w:t>java -cp out/classes:lib/* ke.ku.sco310.qr.cli.QrCliAssembly --help</w:t>
-            </w:r>
-          </w:p>
-        </w:tc>
-        <w:tc>
-          <w:tcPr>
-            <w:tcW w:type="dxa" w:w="2880"/>
-          </w:tcPr>
-          <w:p>
-            <w:r/>
-            <w:r>
-              <w:t>the complete command surface</w:t>
-            </w:r>
-          </w:p>
-        </w:tc>
-      </w:tr>
-      <w:tr>
-        <w:tc>
-          <w:tcPr>
-            <w:tcW w:type="dxa" w:w="2880"/>
-          </w:tcPr>
-          <w:p>
-            <w:r/>
-            <w:r>
-              <w:rPr>
-                <w:rFonts w:ascii="Consolas" w:hAnsi="Consolas"/>
-              </w:rPr>
-              <w:t>07-cli-component-catalogue.png</w:t>
-            </w:r>
-          </w:p>
-        </w:tc>
-        <w:tc>
-          <w:tcPr>
-            <w:tcW w:type="dxa" w:w="2880"/>
-          </w:tcPr>
-          <w:p>
-            <w:r/>
-            <w:r>
-              <w:rPr>
-                <w:rFonts w:ascii="Consolas" w:hAnsi="Consolas"/>
-              </w:rPr>
-              <w:t>java -cp out/classes:lib/* ke.ku.sco310.qr.cli.QrCliAssembly --list-components</w:t>
-            </w:r>
-          </w:p>
-        </w:tc>
-        <w:tc>
-          <w:tcPr>
-            <w:tcW w:type="dxa" w:w="2880"/>
-          </w:tcPr>
-          <w:p>
-            <w:r/>
-            <w:r>
-              <w:t xml:space="preserve">roles with provided </w:t>
-            </w:r>
-            <w:r>
-              <w:rPr>
-                <w:b/>
-              </w:rPr>
-              <w:t>and required</w:t>
-            </w:r>
-            <w:r>
-              <w:t xml:space="preserve"> interfaces, plus component state</w:t>
-            </w:r>
-          </w:p>
-        </w:tc>
-      </w:tr>
-      <w:tr>
-        <w:tc>
-          <w:tcPr>
-            <w:tcW w:type="dxa" w:w="2880"/>
-          </w:tcPr>
-          <w:p>
-            <w:r/>
-            <w:r>
-              <w:rPr>
-                <w:rFonts w:ascii="Consolas" w:hAnsi="Consolas"/>
-              </w:rPr>
-              <w:t>08-cli-png-run.png</w:t>
-            </w:r>
-          </w:p>
-        </w:tc>
-        <w:tc>
-          <w:tcPr>
-            <w:tcW w:type="dxa" w:w="2880"/>
-          </w:tcPr>
-          <w:p>
-            <w:r/>
-            <w:r>
-              <w:rPr>
-                <w:rFonts w:ascii="Consolas" w:hAnsi="Consolas"/>
-              </w:rPr>
-              <w:t>java -cp out/classes:lib/* ke.ku.sco310.qr.cli.QrCliAssembly --text … --format png --show-assembly</w:t>
-            </w:r>
-          </w:p>
-        </w:tc>
-        <w:tc>
-          <w:tcPr>
-            <w:tcW w:type="dxa" w:w="2880"/>
-          </w:tcPr>
-          <w:p>
-            <w:r/>
-            <w:r>
-              <w:t>a full generation run with the deployment report and the XML bean graph</w:t>
-            </w:r>
-          </w:p>
-        </w:tc>
-      </w:tr>
-      <w:tr>
-        <w:tc>
-          <w:tcPr>
-            <w:tcW w:type="dxa" w:w="2880"/>
-          </w:tcPr>
-          <w:p>
-            <w:r/>
-            <w:r>
-              <w:rPr>
-                <w:rFonts w:ascii="Consolas" w:hAnsi="Consolas"/>
-              </w:rPr>
-              <w:t>09-cli-ascii-symbol.png</w:t>
-            </w:r>
-          </w:p>
-        </w:tc>
-        <w:tc>
-          <w:tcPr>
-            <w:tcW w:type="dxa" w:w="2880"/>
-          </w:tcPr>
-          <w:p>
-            <w:r/>
-            <w:r>
-              <w:rPr>
-                <w:rFonts w:ascii="Consolas" w:hAnsi="Consolas"/>
-              </w:rPr>
-              <w:t>java -cp out/classes:lib/* ke.ku.sco310.qr.cli.QrCliAssembly --text "SCO310" --ec H --format ascii --ascii</w:t>
-            </w:r>
-          </w:p>
-        </w:tc>
-        <w:tc>
-          <w:tcPr>
-            <w:tcW w:type="dxa" w:w="2880"/>
-          </w:tcPr>
-          <w:p>
-            <w:r/>
-            <w:r>
-              <w:t>a decodable symbol printed in a terminal (ASCII renderer component)</w:t>
             </w:r>
           </w:p>
         </w:tc>
@@ -25496,7 +25123,7 @@
         <w:rPr>
           <w:b/>
         </w:rPr>
-        <w:t>Defect 5 — property sheet collapsed and preview cropped (medium, presentation).</w:t>
+        <w:t>Defect 5 — settings panel collapsed and preview cropped (medium, presentation).</w:t>
       </w:r>
     </w:p>
     <w:p>
@@ -25515,7 +25142,7 @@
     </w:p>
     <w:p>
       <w:r>
-        <w:t>taller than its content, so the property sheet floated in the middle of the window; and the</w:t>
+        <w:t>taller than its content, so the settings panel floated in the middle of the window; and the</w:t>
       </w:r>
     </w:p>
     <w:p>
@@ -25536,7 +25163,7 @@
         <w:t>Fix</w:t>
       </w:r>
       <w:r>
-        <w:t xml:space="preserve"> the property sheet is hosted in the </w:t>
+        <w:t xml:space="preserve"> the settings panel is hosted in the </w:t>
       </w:r>
       <w:r>
         <w:rPr>
@@ -25559,7 +25186,7 @@
     </w:p>
     <w:p>
       <w:r>
-        <w:t xml:space="preserve">the payload and colour rows received explicit </w:t>
+        <w:t xml:space="preserve">the payload row received explicit </w:t>
       </w:r>
       <w:r>
         <w:rPr>
@@ -25568,12 +25195,7 @@
         <w:t>minimum</w:t>
       </w:r>
       <w:r>
-        <w:t xml:space="preserve"> sizes as well as preferred sizes</w:t>
-      </w:r>
-    </w:p>
-    <w:p>
-      <w:r>
-        <w:t>(</w:t>
+        <w:t xml:space="preserve"> sizes as well as preferred sizes (</w:t>
       </w:r>
       <w:r>
         <w:rPr>
@@ -25581,18 +25203,20 @@
         </w:rPr>
         <w:t>GridBagLayout</w:t>
       </w:r>
-      <w:r>
-        <w:t xml:space="preserve"> honours the minimum when it arranges a grid that would otherwise overflow); and</w:t>
-      </w:r>
-    </w:p>
-    <w:p>
-      <w:r>
-        <w:t>the preview is now a card-switching panel whose raster card paints the artifact scaled to fit with</w:t>
-      </w:r>
-    </w:p>
-    <w:p>
-      <w:r>
-        <w:t>nearest-neighbour interpolation, never enlarged above 1:1 so that module edges stay exact.</w:t>
+    </w:p>
+    <w:p>
+      <w:r>
+        <w:t>honours the minimum when it arranges a grid that would otherwise overflow); and the preview is now</w:t>
+      </w:r>
+    </w:p>
+    <w:p>
+      <w:r>
+        <w:t>a card-switching panel whose raster card paints the artifact scaled to fit with nearest-neighbour</w:t>
+      </w:r>
+    </w:p>
+    <w:p>
+      <w:r>
+        <w:t>interpolation, never enlarged above 1:1 so that module edges stay exact.</w:t>
       </w:r>
     </w:p>
     <w:p>
@@ -26859,9 +26483,7 @@
         <w:br/>
         <w:t>│   ├── ui/              2 files - desktop assembly (front end 1)</w:t>
         <w:br/>
-        <w:t>│   ├── cli/             1 file  - command-line assembly (front end 2)</w:t>
-        <w:br/>
-        <w:t>│   ├── web/             1 file  - HTTP service assembly (front end 3)</w:t>
+        <w:t>│   ├── web/             1 file  - HTTP service assembly (front end 2)</w:t>
         <w:br/>
         <w:t>│   ├── editor/          1 file  - custom property editor</w:t>
         <w:br/>
@@ -26891,7 +26513,7 @@
         <w:br/>
         <w:t xml:space="preserve">    ├── diagrams/                 6 generated figures</w:t>
         <w:br/>
-        <w:t xml:space="preserve">    ├── screenshots/              27 screenshots of code and of running programs</w:t>
+        <w:t xml:space="preserve">    ├── screenshots/              22 screenshots of code and of running programs</w:t>
         <w:br/>
         <w:t xml:space="preserve">    ├── evidence/                 verification transcript, CSVs, artifact gallery, XML graph</w:t>
         <w:br/>
@@ -26994,7 +26616,7 @@
         <w:pStyle w:val="ListBullet"/>
       </w:pPr>
       <w:r>
-        <w:t xml:space="preserve">the three front ends, the introspection tool and the verification suite are ordinary </w:t>
+        <w:t xml:space="preserve">the two front ends, the introspection tool and the verification suite are ordinary </w:t>
       </w:r>
       <w:r>
         <w:rPr>
@@ -27285,7 +26907,13 @@
               <w:t>out/dist/qr-component-suite-1.0.0.jar</w:t>
             </w:r>
             <w:r>
-              <w:t xml:space="preserve"> with the manifest</w:t>
+              <w:t xml:space="preserve"> and the standalone </w:t>
+            </w:r>
+            <w:r>
+              <w:rPr>
+                <w:rFonts w:ascii="Consolas" w:hAnsi="Consolas"/>
+              </w:rPr>
+              <w:t>QrStudio.jar</w:t>
             </w:r>
           </w:p>
         </w:tc>
@@ -27356,11 +26984,13 @@
         <w:br/>
         <w:t>[build] compiling main sources with the JavaCompiler API (--release 11)</w:t>
         <w:br/>
-        <w:t>[build] main classes: 52</w:t>
+        <w:t>[build] main classes: 51</w:t>
         <w:br/>
         <w:t>[build] packaging the components into qr-component-suite-1.0.0.jar (manifest: manifest/MANIFEST.MF)</w:t>
         <w:br/>
-        <w:t>[build] jar written: out/dist/qr-component-suite-1.0.0.jar (124565 bytes, 53 entries)</w:t>
+        <w:t>[build] jar written: out/dist/qr-component-suite-1.0.0.jar (118882 bytes, 52 entries)</w:t>
+        <w:br/>
+        <w:t>[build] standalone app written: QrStudio.jar (762259 bytes, 360 entries)</w:t>
         <w:br/>
         <w:t>[build] done</w:t>
       </w:r>
@@ -27467,7 +27097,7 @@
         <w:rPr>
           <w:color w:val="1B5E20"/>
         </w:rPr>
-        <w:t>10.3 Running the three assemblies</w:t>
+        <w:t>10.3 Running the two assemblies</w:t>
       </w:r>
     </w:p>
     <w:p>
@@ -27487,41 +27117,32 @@
           <w:rFonts w:ascii="Consolas" w:hAnsi="Consolas"/>
           <w:sz w:val="16"/>
         </w:rPr>
-        <w:t>java -cp out/classes:lib/* ke.ku.sco310.qr.ui.QrStudioGuiAssembly</w:t>
+        <w:t>java -jar QrStudio.jar</w:t>
         <w:br/>
         <w:t># or, for an automated capture of the real window:</w:t>
         <w:br/>
-        <w:t>xvfb-run -a java -cp out/classes:lib/core-3.5.3.jar:lib/javase-3.5.3.jar \</w:t>
-        <w:br/>
-        <w:t xml:space="preserve">     ke.ku.sco310.qr.ui.QrStudioGuiAssembly --format PNG --screenshot docs/screenshots/gui.png</w:t>
-      </w:r>
-    </w:p>
-    <w:p>
-      <w:r>
-        <w:rPr>
-          <w:b/>
-        </w:rPr>
-        <w:t>Command-line assembly</w:t>
-      </w:r>
-    </w:p>
-    <w:p>
-      <w:pPr>
-        <w:spacing w:before="80" w:after="160"/>
-      </w:pPr>
+        <w:t>java -jar QrStudio.jar --format PNG --screenshot docs/screenshots/gui.png</w:t>
+      </w:r>
+    </w:p>
+    <w:p>
       <w:r>
         <w:rPr>
           <w:rFonts w:ascii="Consolas" w:hAnsi="Consolas"/>
-          <w:sz w:val="16"/>
-        </w:rPr>
-        <w:t>java -cp out/classes:lib/* ke.ku.sco310.qr.cli.QrCliAssembly --text "https://www.ku.ac.ke/sco310" --ec M --format png</w:t>
-        <w:br/>
-        <w:t>java -cp out/classes:lib/* ke.ku.sco310.qr.cli.QrCliAssembly --list-components</w:t>
-        <w:br/>
-        <w:t>java -cp out/classes:lib/* ke.ku.sco310.qr.cli.QrCliAssembly --inspect ke.ku.sco310.qr.store.QrHistoryBean</w:t>
-        <w:br/>
-        <w:t>java -cp out/classes:lib/* ke.ku.sco310.qr.cli.QrCliAssembly --text "SCO310" --format svg --save-assembly out/assembly-mine.xml</w:t>
-        <w:br/>
-        <w:t>java -cp out/classes:lib/* ke.ku.sco310.qr.cli.QrCliAssembly --load-assembly out/assembly-mine.xml --format ascii --ascii</w:t>
+        </w:rPr>
+        <w:t>QrStudio.jar</w:t>
+      </w:r>
+      <w:r>
+        <w:t xml:space="preserve"> is self-contained (the component classes and the optional ZXing classes are inside</w:t>
+      </w:r>
+    </w:p>
+    <w:p>
+      <w:r>
+        <w:t>the archive), so it can be copied to any machine with Java 11+ and double-clicked. No scripts or</w:t>
+      </w:r>
+    </w:p>
+    <w:p>
+      <w:r>
+        <w:t>class-path setup are needed.</w:t>
       </w:r>
     </w:p>
     <w:p>
@@ -27744,7 +27365,7 @@
               <w:t>BeanInfo</w:t>
             </w:r>
             <w:r>
-              <w:t>, custom property editor, customiser (the GUI property sheet), two persistence mechanisms</w:t>
+              <w:t>, custom property editor, two persistence mechanisms</w:t>
             </w:r>
           </w:p>
         </w:tc>
@@ -28224,22 +27845,22 @@
         <w:t>Practically</w:t>
       </w:r>
       <w:r>
-        <w:t>, the same compiled components serve a desktop GUI, a command-line tool and an HTTP</w:t>
-      </w:r>
-    </w:p>
-    <w:p>
-      <w:r>
-        <w:t>service, and the renderer or the entire encoder can be replaced at run time by editing an XML</w:t>
-      </w:r>
-    </w:p>
-    <w:p>
-      <w:r>
-        <w:t>descriptor or by calling one setter — with the assembly tests proving that a swapped component</w:t>
-      </w:r>
-    </w:p>
-    <w:p>
-      <w:r>
-        <w:t>still produces the same symbol.</w:t>
+        <w:t>, the same compiled components serve a desktop GUI and an HTTP service, and the</w:t>
+      </w:r>
+    </w:p>
+    <w:p>
+      <w:r>
+        <w:t>renderer or the entire encoder can be replaced at run time by editing an XML descriptor or by</w:t>
+      </w:r>
+    </w:p>
+    <w:p>
+      <w:r>
+        <w:t>calling one setter — with the assembly tests proving that a swapped component still produces the</w:t>
+      </w:r>
+    </w:p>
+    <w:p>
+      <w:r>
+        <w:t>same symbol.</w:t>
       </w:r>
     </w:p>
     <w:p>
@@ -28911,33 +28532,6 @@
           </w:p>
         </w:tc>
       </w:tr>
-      <w:tr>
-        <w:tc>
-          <w:tcPr>
-            <w:tcW w:type="dxa" w:w="4320"/>
-          </w:tcPr>
-          <w:p>
-            <w:r/>
-            <w:r>
-              <w:rPr>
-                <w:rFonts w:ascii="Consolas" w:hAnsi="Consolas"/>
-              </w:rPr>
-              <w:t>docs/evidence/work/assembly-test-*/history.ser</w:t>
-            </w:r>
-          </w:p>
-        </w:tc>
-        <w:tc>
-          <w:tcPr>
-            <w:tcW w:type="dxa" w:w="4320"/>
-          </w:tcPr>
-          <w:p>
-            <w:r/>
-            <w:r>
-              <w:t>history files written by the repository component</w:t>
-            </w:r>
-          </w:p>
-        </w:tc>
-      </w:tr>
     </w:tbl>
     <w:p/>
     <w:p>
@@ -29935,7 +29529,7 @@
         <w:t>PureJavaQrEncoderBean</w:t>
       </w:r>
       <w:r>
-        <w:t>, deployed into three different</w:t>
+        <w:t>, deployed into two different</w:t>
       </w:r>
     </w:p>
     <w:p>
@@ -30038,7 +29632,7 @@
         <w:rPr>
           <w:rFonts w:ascii="Consolas" w:hAnsi="Consolas"/>
         </w:rPr>
-        <w:t>java -cp out/classes:lib/* ke.ku.sco310.qr.cli.QrCliAssembly --inspect &lt;class&gt;</w:t>
+        <w:t>java -cp out/classes ke.ku.sco310.qr.tools.BeanInspector &lt;class&gt;</w:t>
       </w:r>
       <w:r>
         <w:t xml:space="preserve"> demonstrates steps 3–6 and 8 on the compiled bytecode.</w:t>
@@ -30063,7 +29657,7 @@
         <w:rPr>
           <w:rFonts w:ascii="Consolas" w:hAnsi="Consolas"/>
         </w:rPr>
-        <w:t>tools/make_diagrams.py</w:t>
+        <w:t>docs/report-tooling/make_diagrams.py</w:t>
       </w:r>
       <w:r>
         <w:t xml:space="preserve">, </w:t>
@@ -30072,7 +29666,7 @@
         <w:rPr>
           <w:rFonts w:ascii="Consolas" w:hAnsi="Consolas"/>
         </w:rPr>
-        <w:t>tools/capture_screenshots.py</w:t>
+        <w:t>docs/report-tooling/capture_screenshots.py</w:t>
       </w:r>
       <w:r>
         <w:t>).</w:t>
@@ -30462,7 +30056,7 @@
         <w:t>Screenshot 1.</w:t>
       </w:r>
       <w:r>
-        <w:t xml:space="preserve"> The desktop assembly, PNG renderer component: property sheet, live preview, indexed history.</w:t>
+        <w:t xml:space="preserve"> The desktop assembly, PNG renderer component: payload and format controls, live preview, indexed history.</w:t>
       </w:r>
     </w:p>
     <w:p>
@@ -30509,7 +30103,7 @@
         <w:t>Screenshot 2.</w:t>
       </w:r>
       <w:r>
-        <w:t xml:space="preserve"> The same running application after the renderer component was replaced by renderer.svg.v1.</w:t>
+        <w:t xml:space="preserve"> The same running application after the renderer component was replaced by renderer.svg.v1; the SVG artifact is previewed as a QR image.</w:t>
       </w:r>
     </w:p>
     <w:p>
@@ -30603,194 +30197,6 @@
         <w:t>Screenshot 4.</w:t>
       </w:r>
       <w:r>
-        <w:t xml:space="preserve"> The command-line assembly: complete option surface.</w:t>
-      </w:r>
-    </w:p>
-    <w:p>
-      <w:r>
-        <w:drawing>
-          <wp:inline xmlns:a="http://schemas.openxmlformats.org/drawingml/2006/main" xmlns:pic="http://schemas.openxmlformats.org/drawingml/2006/picture">
-            <wp:extent cx="5760720" cy="2875113"/>
-            <wp:docPr id="12" name="Picture 12"/>
-            <wp:cNvGraphicFramePr>
-              <a:graphicFrameLocks noChangeAspect="1"/>
-            </wp:cNvGraphicFramePr>
-            <a:graphic>
-              <a:graphicData uri="http://schemas.openxmlformats.org/drawingml/2006/picture">
-                <pic:pic>
-                  <pic:nvPicPr>
-                    <pic:cNvPr id="0" name="06-cli-help.png"/>
-                    <pic:cNvPicPr/>
-                  </pic:nvPicPr>
-                  <pic:blipFill>
-                    <a:blip r:embed="rId20"/>
-                    <a:stretch>
-                      <a:fillRect/>
-                    </a:stretch>
-                  </pic:blipFill>
-                  <pic:spPr>
-                    <a:xfrm>
-                      <a:off x="0" y="0"/>
-                      <a:ext cx="5760720" cy="2875113"/>
-                    </a:xfrm>
-                    <a:prstGeom prst="rect"/>
-                  </pic:spPr>
-                </pic:pic>
-              </a:graphicData>
-            </a:graphic>
-          </wp:inline>
-        </w:drawing>
-      </w:r>
-    </w:p>
-    <w:p>
-      <w:r>
-        <w:rPr>
-          <w:b/>
-        </w:rPr>
-        <w:t>Screenshot 5.</w:t>
-      </w:r>
-      <w:r>
-        <w:t xml:space="preserve"> The component catalogue with roles, provided interfaces, required interfaces and state.</w:t>
-      </w:r>
-    </w:p>
-    <w:p>
-      <w:r>
-        <w:drawing>
-          <wp:inline xmlns:a="http://schemas.openxmlformats.org/drawingml/2006/main" xmlns:pic="http://schemas.openxmlformats.org/drawingml/2006/picture">
-            <wp:extent cx="5760720" cy="2875113"/>
-            <wp:docPr id="13" name="Picture 13"/>
-            <wp:cNvGraphicFramePr>
-              <a:graphicFrameLocks noChangeAspect="1"/>
-            </wp:cNvGraphicFramePr>
-            <a:graphic>
-              <a:graphicData uri="http://schemas.openxmlformats.org/drawingml/2006/picture">
-                <pic:pic>
-                  <pic:nvPicPr>
-                    <pic:cNvPr id="0" name="07-cli-component-catalogue.png"/>
-                    <pic:cNvPicPr/>
-                  </pic:nvPicPr>
-                  <pic:blipFill>
-                    <a:blip r:embed="rId21"/>
-                    <a:stretch>
-                      <a:fillRect/>
-                    </a:stretch>
-                  </pic:blipFill>
-                  <pic:spPr>
-                    <a:xfrm>
-                      <a:off x="0" y="0"/>
-                      <a:ext cx="5760720" cy="2875113"/>
-                    </a:xfrm>
-                    <a:prstGeom prst="rect"/>
-                  </pic:spPr>
-                </pic:pic>
-              </a:graphicData>
-            </a:graphic>
-          </wp:inline>
-        </w:drawing>
-      </w:r>
-    </w:p>
-    <w:p>
-      <w:r>
-        <w:rPr>
-          <w:b/>
-        </w:rPr>
-        <w:t>Screenshot 6.</w:t>
-      </w:r>
-      <w:r>
-        <w:t xml:space="preserve"> A full generation run: deployment report, result, deployment XML reuse.</w:t>
-      </w:r>
-    </w:p>
-    <w:p>
-      <w:r>
-        <w:drawing>
-          <wp:inline xmlns:a="http://schemas.openxmlformats.org/drawingml/2006/main" xmlns:pic="http://schemas.openxmlformats.org/drawingml/2006/picture">
-            <wp:extent cx="5614106" cy="7863839"/>
-            <wp:docPr id="14" name="Picture 14"/>
-            <wp:cNvGraphicFramePr>
-              <a:graphicFrameLocks noChangeAspect="1"/>
-            </wp:cNvGraphicFramePr>
-            <a:graphic>
-              <a:graphicData uri="http://schemas.openxmlformats.org/drawingml/2006/picture">
-                <pic:pic>
-                  <pic:nvPicPr>
-                    <pic:cNvPr id="0" name="08-cli-png-run.png"/>
-                    <pic:cNvPicPr/>
-                  </pic:nvPicPr>
-                  <pic:blipFill>
-                    <a:blip r:embed="rId22"/>
-                    <a:stretch>
-                      <a:fillRect/>
-                    </a:stretch>
-                  </pic:blipFill>
-                  <pic:spPr>
-                    <a:xfrm>
-                      <a:off x="0" y="0"/>
-                      <a:ext cx="5614106" cy="7863839"/>
-                    </a:xfrm>
-                    <a:prstGeom prst="rect"/>
-                  </pic:spPr>
-                </pic:pic>
-              </a:graphicData>
-            </a:graphic>
-          </wp:inline>
-        </w:drawing>
-      </w:r>
-    </w:p>
-    <w:p>
-      <w:r>
-        <w:rPr>
-          <w:b/>
-        </w:rPr>
-        <w:t>Screenshot 7.</w:t>
-      </w:r>
-      <w:r>
-        <w:t xml:space="preserve"> A decodable symbol printed in a terminal by the ASCII renderer component.</w:t>
-      </w:r>
-    </w:p>
-    <w:p>
-      <w:r>
-        <w:drawing>
-          <wp:inline xmlns:a="http://schemas.openxmlformats.org/drawingml/2006/main" xmlns:pic="http://schemas.openxmlformats.org/drawingml/2006/picture">
-            <wp:extent cx="3016620" cy="7863838"/>
-            <wp:docPr id="15" name="Picture 15"/>
-            <wp:cNvGraphicFramePr>
-              <a:graphicFrameLocks noChangeAspect="1"/>
-            </wp:cNvGraphicFramePr>
-            <a:graphic>
-              <a:graphicData uri="http://schemas.openxmlformats.org/drawingml/2006/picture">
-                <pic:pic>
-                  <pic:nvPicPr>
-                    <pic:cNvPr id="0" name="09-cli-ascii-symbol.png"/>
-                    <pic:cNvPicPr/>
-                  </pic:nvPicPr>
-                  <pic:blipFill>
-                    <a:blip r:embed="rId23"/>
-                    <a:stretch>
-                      <a:fillRect/>
-                    </a:stretch>
-                  </pic:blipFill>
-                  <pic:spPr>
-                    <a:xfrm>
-                      <a:off x="0" y="0"/>
-                      <a:ext cx="3016620" cy="7863838"/>
-                    </a:xfrm>
-                    <a:prstGeom prst="rect"/>
-                  </pic:spPr>
-                </pic:pic>
-              </a:graphicData>
-            </a:graphic>
-          </wp:inline>
-        </w:drawing>
-      </w:r>
-    </w:p>
-    <w:p>
-      <w:r>
-        <w:rPr>
-          <w:b/>
-        </w:rPr>
-        <w:t>Screenshot 8.</w:t>
-      </w:r>
-      <w:r>
         <w:t xml:space="preserve"> Run-time introspection of the PNG renderer bean.</w:t>
       </w:r>
     </w:p>
@@ -30799,7 +30205,7 @@
         <w:drawing>
           <wp:inline xmlns:a="http://schemas.openxmlformats.org/drawingml/2006/main" xmlns:pic="http://schemas.openxmlformats.org/drawingml/2006/picture">
             <wp:extent cx="5760720" cy="5406214"/>
-            <wp:docPr id="16" name="Picture 16"/>
+            <wp:docPr id="12" name="Picture 12"/>
             <wp:cNvGraphicFramePr>
               <a:graphicFrameLocks noChangeAspect="1"/>
             </wp:cNvGraphicFramePr>
@@ -30811,7 +30217,7 @@
                     <pic:cNvPicPr/>
                   </pic:nvPicPr>
                   <pic:blipFill>
-                    <a:blip r:embed="rId24"/>
+                    <a:blip r:embed="rId20"/>
                     <a:stretch>
                       <a:fillRect/>
                     </a:stretch>
@@ -30835,7 +30241,7 @@
         <w:rPr>
           <w:b/>
         </w:rPr>
-        <w:t>Screenshot 9.</w:t>
+        <w:t>Screenshot 5.</w:t>
       </w:r>
       <w:r>
         <w:t xml:space="preserve"> Introspection of the indexed/constrained history bean and the facade event set.</w:t>
@@ -30846,7 +30252,7 @@
         <w:drawing>
           <wp:inline xmlns:a="http://schemas.openxmlformats.org/drawingml/2006/main" xmlns:pic="http://schemas.openxmlformats.org/drawingml/2006/picture">
             <wp:extent cx="4063910" cy="7863840"/>
-            <wp:docPr id="17" name="Picture 17"/>
+            <wp:docPr id="13" name="Picture 13"/>
             <wp:cNvGraphicFramePr>
               <a:graphicFrameLocks noChangeAspect="1"/>
             </wp:cNvGraphicFramePr>
@@ -30858,7 +30264,7 @@
                     <pic:cNvPicPr/>
                   </pic:nvPicPr>
                   <pic:blipFill>
-                    <a:blip r:embed="rId25"/>
+                    <a:blip r:embed="rId21"/>
                     <a:stretch>
                       <a:fillRect/>
                     </a:stretch>
@@ -30882,7 +30288,7 @@
         <w:rPr>
           <w:b/>
         </w:rPr>
-        <w:t>Screenshot 10.</w:t>
+        <w:t>Screenshot 6.</w:t>
       </w:r>
       <w:r>
         <w:t xml:space="preserve"> The verification transcript: 108 checks, 108 passed, 0 failed.</w:t>
@@ -30893,7 +30299,7 @@
         <w:drawing>
           <wp:inline xmlns:a="http://schemas.openxmlformats.org/drawingml/2006/main" xmlns:pic="http://schemas.openxmlformats.org/drawingml/2006/picture">
             <wp:extent cx="4703830" cy="7863839"/>
-            <wp:docPr id="18" name="Picture 18"/>
+            <wp:docPr id="14" name="Picture 14"/>
             <wp:cNvGraphicFramePr>
               <a:graphicFrameLocks noChangeAspect="1"/>
             </wp:cNvGraphicFramePr>
@@ -30905,7 +30311,7 @@
                     <pic:cNvPicPr/>
                   </pic:nvPicPr>
                   <pic:blipFill>
-                    <a:blip r:embed="rId26"/>
+                    <a:blip r:embed="rId22"/>
                     <a:stretch>
                       <a:fillRect/>
                     </a:stretch>
@@ -30929,7 +30335,7 @@
         <w:rPr>
           <w:b/>
         </w:rPr>
-        <w:t>Screenshot 11.</w:t>
+        <w:t>Screenshot 7.</w:t>
       </w:r>
       <w:r>
         <w:t xml:space="preserve"> Build, verify and package in one command.</w:t>
@@ -30940,7 +30346,7 @@
         <w:drawing>
           <wp:inline xmlns:a="http://schemas.openxmlformats.org/drawingml/2006/main" xmlns:pic="http://schemas.openxmlformats.org/drawingml/2006/picture">
             <wp:extent cx="5760720" cy="2914825"/>
-            <wp:docPr id="19" name="Picture 19"/>
+            <wp:docPr id="15" name="Picture 15"/>
             <wp:cNvGraphicFramePr>
               <a:graphicFrameLocks noChangeAspect="1"/>
             </wp:cNvGraphicFramePr>
@@ -30952,7 +30358,7 @@
                     <pic:cNvPicPr/>
                   </pic:nvPicPr>
                   <pic:blipFill>
-                    <a:blip r:embed="rId27"/>
+                    <a:blip r:embed="rId23"/>
                     <a:stretch>
                       <a:fillRect/>
                     </a:stretch>
@@ -30976,7 +30382,7 @@
         <w:rPr>
           <w:b/>
         </w:rPr>
-        <w:t>Screenshot 12.</w:t>
+        <w:t>Screenshot 8.</w:t>
       </w:r>
       <w:r>
         <w:t xml:space="preserve"> The deployment interface: Java-Bean: True entries for all nine beans.</w:t>
@@ -30987,7 +30393,7 @@
         <w:drawing>
           <wp:inline xmlns:a="http://schemas.openxmlformats.org/drawingml/2006/main" xmlns:pic="http://schemas.openxmlformats.org/drawingml/2006/picture">
             <wp:extent cx="5564344" cy="7863839"/>
-            <wp:docPr id="20" name="Picture 20"/>
+            <wp:docPr id="16" name="Picture 16"/>
             <wp:cNvGraphicFramePr>
               <a:graphicFrameLocks noChangeAspect="1"/>
             </wp:cNvGraphicFramePr>
@@ -30999,7 +30405,7 @@
                     <pic:cNvPicPr/>
                   </pic:nvPicPr>
                   <pic:blipFill>
-                    <a:blip r:embed="rId28"/>
+                    <a:blip r:embed="rId24"/>
                     <a:stretch>
                       <a:fillRect/>
                     </a:stretch>
@@ -31023,7 +30429,7 @@
         <w:rPr>
           <w:b/>
         </w:rPr>
-        <w:t>Screenshot 13.</w:t>
+        <w:t>Screenshot 9.</w:t>
       </w:r>
       <w:r>
         <w:t xml:space="preserve"> The HTTP assembly answering /qr, /stats and /history.</w:t>
@@ -31034,7 +30440,7 @@
         <w:drawing>
           <wp:inline xmlns:a="http://schemas.openxmlformats.org/drawingml/2006/main" xmlns:pic="http://schemas.openxmlformats.org/drawingml/2006/picture">
             <wp:extent cx="5760720" cy="4759305"/>
-            <wp:docPr id="21" name="Picture 21"/>
+            <wp:docPr id="17" name="Picture 17"/>
             <wp:cNvGraphicFramePr>
               <a:graphicFrameLocks noChangeAspect="1"/>
             </wp:cNvGraphicFramePr>
@@ -31046,7 +30452,7 @@
                     <pic:cNvPicPr/>
                   </pic:nvPicPr>
                   <pic:blipFill>
-                    <a:blip r:embed="rId29"/>
+                    <a:blip r:embed="rId25"/>
                     <a:stretch>
                       <a:fillRect/>
                     </a:stretch>
@@ -31081,7 +30487,7 @@
         <w:drawing>
           <wp:inline xmlns:a="http://schemas.openxmlformats.org/drawingml/2006/main" xmlns:pic="http://schemas.openxmlformats.org/drawingml/2006/picture">
             <wp:extent cx="5760720" cy="7533696"/>
-            <wp:docPr id="22" name="Picture 22"/>
+            <wp:docPr id="18" name="Picture 18"/>
             <wp:cNvGraphicFramePr>
               <a:graphicFrameLocks noChangeAspect="1"/>
             </wp:cNvGraphicFramePr>
@@ -31093,7 +30499,7 @@
                     <pic:cNvPicPr/>
                   </pic:nvPicPr>
                   <pic:blipFill>
-                    <a:blip r:embed="rId30"/>
+                    <a:blip r:embed="rId26"/>
                     <a:stretch>
                       <a:fillRect/>
                     </a:stretch>
@@ -31128,7 +30534,7 @@
         <w:drawing>
           <wp:inline xmlns:a="http://schemas.openxmlformats.org/drawingml/2006/main" xmlns:pic="http://schemas.openxmlformats.org/drawingml/2006/picture">
             <wp:extent cx="5760720" cy="6485054"/>
-            <wp:docPr id="23" name="Picture 23"/>
+            <wp:docPr id="19" name="Picture 19"/>
             <wp:cNvGraphicFramePr>
               <a:graphicFrameLocks noChangeAspect="1"/>
             </wp:cNvGraphicFramePr>
@@ -31140,7 +30546,7 @@
                     <pic:cNvPicPr/>
                   </pic:nvPicPr>
                   <pic:blipFill>
-                    <a:blip r:embed="rId31"/>
+                    <a:blip r:embed="rId27"/>
                     <a:stretch>
                       <a:fillRect/>
                     </a:stretch>
@@ -31175,7 +30581,7 @@
         <w:drawing>
           <wp:inline xmlns:a="http://schemas.openxmlformats.org/drawingml/2006/main" xmlns:pic="http://schemas.openxmlformats.org/drawingml/2006/picture">
             <wp:extent cx="5760720" cy="6542899"/>
-            <wp:docPr id="24" name="Picture 24"/>
+            <wp:docPr id="20" name="Picture 20"/>
             <wp:cNvGraphicFramePr>
               <a:graphicFrameLocks noChangeAspect="1"/>
             </wp:cNvGraphicFramePr>
@@ -31187,7 +30593,7 @@
                     <pic:cNvPicPr/>
                   </pic:nvPicPr>
                   <pic:blipFill>
-                    <a:blip r:embed="rId32"/>
+                    <a:blip r:embed="rId28"/>
                     <a:stretch>
                       <a:fillRect/>
                     </a:stretch>
@@ -31222,7 +30628,7 @@
         <w:drawing>
           <wp:inline xmlns:a="http://schemas.openxmlformats.org/drawingml/2006/main" xmlns:pic="http://schemas.openxmlformats.org/drawingml/2006/picture">
             <wp:extent cx="5760720" cy="7206461"/>
-            <wp:docPr id="25" name="Picture 25"/>
+            <wp:docPr id="21" name="Picture 21"/>
             <wp:cNvGraphicFramePr>
               <a:graphicFrameLocks noChangeAspect="1"/>
             </wp:cNvGraphicFramePr>
@@ -31234,7 +30640,7 @@
                     <pic:cNvPicPr/>
                   </pic:nvPicPr>
                   <pic:blipFill>
-                    <a:blip r:embed="rId33"/>
+                    <a:blip r:embed="rId29"/>
                     <a:stretch>
                       <a:fillRect/>
                     </a:stretch>
@@ -31269,7 +30675,7 @@
         <w:drawing>
           <wp:inline xmlns:a="http://schemas.openxmlformats.org/drawingml/2006/main" xmlns:pic="http://schemas.openxmlformats.org/drawingml/2006/picture">
             <wp:extent cx="5760720" cy="6784980"/>
-            <wp:docPr id="26" name="Picture 26"/>
+            <wp:docPr id="22" name="Picture 22"/>
             <wp:cNvGraphicFramePr>
               <a:graphicFrameLocks noChangeAspect="1"/>
             </wp:cNvGraphicFramePr>
@@ -31281,7 +30687,7 @@
                     <pic:cNvPicPr/>
                   </pic:nvPicPr>
                   <pic:blipFill>
-                    <a:blip r:embed="rId34"/>
+                    <a:blip r:embed="rId30"/>
                     <a:stretch>
                       <a:fillRect/>
                     </a:stretch>
@@ -31316,7 +30722,7 @@
         <w:drawing>
           <wp:inline xmlns:a="http://schemas.openxmlformats.org/drawingml/2006/main" xmlns:pic="http://schemas.openxmlformats.org/drawingml/2006/picture">
             <wp:extent cx="5760720" cy="5015452"/>
-            <wp:docPr id="27" name="Picture 27"/>
+            <wp:docPr id="23" name="Picture 23"/>
             <wp:cNvGraphicFramePr>
               <a:graphicFrameLocks noChangeAspect="1"/>
             </wp:cNvGraphicFramePr>
@@ -31328,7 +30734,7 @@
                     <pic:cNvPicPr/>
                   </pic:nvPicPr>
                   <pic:blipFill>
-                    <a:blip r:embed="rId35"/>
+                    <a:blip r:embed="rId31"/>
                     <a:stretch>
                       <a:fillRect/>
                     </a:stretch>
@@ -31363,7 +30769,7 @@
         <w:drawing>
           <wp:inline xmlns:a="http://schemas.openxmlformats.org/drawingml/2006/main" xmlns:pic="http://schemas.openxmlformats.org/drawingml/2006/picture">
             <wp:extent cx="5760720" cy="6722795"/>
-            <wp:docPr id="28" name="Picture 28"/>
+            <wp:docPr id="24" name="Picture 24"/>
             <wp:cNvGraphicFramePr>
               <a:graphicFrameLocks noChangeAspect="1"/>
             </wp:cNvGraphicFramePr>
@@ -31375,7 +30781,7 @@
                     <pic:cNvPicPr/>
                   </pic:nvPicPr>
                   <pic:blipFill>
-                    <a:blip r:embed="rId36"/>
+                    <a:blip r:embed="rId32"/>
                     <a:stretch>
                       <a:fillRect/>
                     </a:stretch>
@@ -31402,53 +30808,6 @@
         <w:t>Listing 10.</w:t>
       </w:r>
       <w:r>
-        <w:t xml:space="preserve"> cli/QrCliAssembly.java - the command-line front end.</w:t>
-      </w:r>
-    </w:p>
-    <w:p>
-      <w:r>
-        <w:drawing>
-          <wp:inline xmlns:a="http://schemas.openxmlformats.org/drawingml/2006/main" xmlns:pic="http://schemas.openxmlformats.org/drawingml/2006/picture">
-            <wp:extent cx="5760720" cy="5951947"/>
-            <wp:docPr id="29" name="Picture 29"/>
-            <wp:cNvGraphicFramePr>
-              <a:graphicFrameLocks noChangeAspect="1"/>
-            </wp:cNvGraphicFramePr>
-            <a:graphic>
-              <a:graphicData uri="http://schemas.openxmlformats.org/drawingml/2006/picture">
-                <pic:pic>
-                  <pic:nvPicPr>
-                    <pic:cNvPr id="0" name="23-code-cli-assembly.png"/>
-                    <pic:cNvPicPr/>
-                  </pic:nvPicPr>
-                  <pic:blipFill>
-                    <a:blip r:embed="rId37"/>
-                    <a:stretch>
-                      <a:fillRect/>
-                    </a:stretch>
-                  </pic:blipFill>
-                  <pic:spPr>
-                    <a:xfrm>
-                      <a:off x="0" y="0"/>
-                      <a:ext cx="5760720" cy="5951947"/>
-                    </a:xfrm>
-                    <a:prstGeom prst="rect"/>
-                  </pic:spPr>
-                </pic:pic>
-              </a:graphicData>
-            </a:graphic>
-          </wp:inline>
-        </w:drawing>
-      </w:r>
-    </w:p>
-    <w:p>
-      <w:r>
-        <w:rPr>
-          <w:b/>
-        </w:rPr>
-        <w:t>Listing 11.</w:t>
-      </w:r>
-      <w:r>
         <w:t xml:space="preserve"> components/ZxingQrEncoderAdapterBean.java - third-party composition behind our own interface.</w:t>
       </w:r>
     </w:p>
@@ -31457,7 +30816,7 @@
         <w:drawing>
           <wp:inline xmlns:a="http://schemas.openxmlformats.org/drawingml/2006/main" xmlns:pic="http://schemas.openxmlformats.org/drawingml/2006/picture">
             <wp:extent cx="5760720" cy="5842848"/>
-            <wp:docPr id="30" name="Picture 30"/>
+            <wp:docPr id="25" name="Picture 25"/>
             <wp:cNvGraphicFramePr>
               <a:graphicFrameLocks noChangeAspect="1"/>
             </wp:cNvGraphicFramePr>
@@ -31469,7 +30828,7 @@
                     <pic:cNvPicPr/>
                   </pic:nvPicPr>
                   <pic:blipFill>
-                    <a:blip r:embed="rId38"/>
+                    <a:blip r:embed="rId33"/>
                     <a:stretch>
                       <a:fillRect/>
                     </a:stretch>
@@ -31493,7 +30852,7 @@
         <w:rPr>
           <w:b/>
         </w:rPr>
-        <w:t>Listing 12.</w:t>
+        <w:t>Listing 11.</w:t>
       </w:r>
       <w:r>
         <w:t xml:space="preserve"> test/EngineReferenceTest.java - the independent-oracle checks.</w:t>
@@ -31504,7 +30863,7 @@
         <w:drawing>
           <wp:inline xmlns:a="http://schemas.openxmlformats.org/drawingml/2006/main" xmlns:pic="http://schemas.openxmlformats.org/drawingml/2006/picture">
             <wp:extent cx="5760720" cy="6661741"/>
-            <wp:docPr id="31" name="Picture 31"/>
+            <wp:docPr id="26" name="Picture 26"/>
             <wp:cNvGraphicFramePr>
               <a:graphicFrameLocks noChangeAspect="1"/>
             </wp:cNvGraphicFramePr>
@@ -31516,7 +30875,7 @@
                     <pic:cNvPicPr/>
                   </pic:nvPicPr>
                   <pic:blipFill>
-                    <a:blip r:embed="rId39"/>
+                    <a:blip r:embed="rId34"/>
                     <a:stretch>
                       <a:fillRect/>
                     </a:stretch>
@@ -31540,7 +30899,7 @@
         <w:rPr>
           <w:b/>
         </w:rPr>
-        <w:t>Screenshot 14.</w:t>
+        <w:t>Screenshot 10.</w:t>
       </w:r>
       <w:r>
         <w:t xml:space="preserve"> The bean feature matrix across four components in one view.</w:t>
@@ -31551,7 +30910,7 @@
         <w:drawing>
           <wp:inline xmlns:a="http://schemas.openxmlformats.org/drawingml/2006/main" xmlns:pic="http://schemas.openxmlformats.org/drawingml/2006/picture">
             <wp:extent cx="2113158" cy="7863838"/>
-            <wp:docPr id="32" name="Picture 32"/>
+            <wp:docPr id="27" name="Picture 27"/>
             <wp:cNvGraphicFramePr>
               <a:graphicFrameLocks noChangeAspect="1"/>
             </wp:cNvGraphicFramePr>
@@ -31563,7 +30922,7 @@
                     <pic:cNvPicPr/>
                   </pic:nvPicPr>
                   <pic:blipFill>
-                    <a:blip r:embed="rId40"/>
+                    <a:blip r:embed="rId35"/>
                     <a:stretch>
                       <a:fillRect/>
                     </a:stretch>
@@ -31587,7 +30946,7 @@
         <w:rPr>
           <w:b/>
         </w:rPr>
-        <w:t>Screenshot 15.</w:t>
+        <w:t>Screenshot 11.</w:t>
       </w:r>
       <w:r>
         <w:t xml:space="preserve"> The artifact returned by the HTTP service for a PNG request.</w:t>
@@ -31598,7 +30957,7 @@
         <w:drawing>
           <wp:inline xmlns:a="http://schemas.openxmlformats.org/drawingml/2006/main" xmlns:pic="http://schemas.openxmlformats.org/drawingml/2006/picture">
             <wp:extent cx="5760720" cy="5760720"/>
-            <wp:docPr id="33" name="Picture 33"/>
+            <wp:docPr id="28" name="Picture 28"/>
             <wp:cNvGraphicFramePr>
               <a:graphicFrameLocks noChangeAspect="1"/>
             </wp:cNvGraphicFramePr>
@@ -31610,7 +30969,7 @@
                     <pic:cNvPicPr/>
                   </pic:nvPicPr>
                   <pic:blipFill>
-                    <a:blip r:embed="rId41"/>
+                    <a:blip r:embed="rId36"/>
                     <a:stretch>
                       <a:fillRect/>
                     </a:stretch>

</xml_diff>